<commit_message>
technicka sprava ADAM final
</commit_message>
<xml_diff>
--- a/ZS_2026-27/Geodezia_1/Zadania/MOLNAR_GEODEZIA_ZADANIE_1/MOLNAR_Zadanie_1_Teodolit_vypracovane.docx
+++ b/ZS_2026-27/Geodezia_1/Zadania/MOLNAR_GEODEZIA_ZADANIE_1/MOLNAR_Zadanie_1_Teodolit_vypracovane.docx
@@ -5,13 +5,10 @@
     <w:p>
       <w:pPr>
         <w:jc w:val="center"/>
-        <w:widowControl/>
-      </w:pPr>
-      <w:proofErr w:type="spellStart"/>
-      <w:r>
-        <w:rPr>
-          <w:rFonts w:ascii="Times New Roman" w:hAnsi="Times New Roman"/>
-          <w:color w:val="000000"/>
+      </w:pPr>
+      <w:proofErr w:type="spellStart"/>
+      <w:r>
+        <w:rPr>
           <w:sz w:val="28"/>
           <w:szCs w:val="28"/>
         </w:rPr>
@@ -20,8 +17,6 @@
       <w:proofErr w:type="spellEnd"/>
       <w:r>
         <w:rPr>
-          <w:rFonts w:ascii="Times New Roman" w:hAnsi="Times New Roman"/>
-          <w:color w:val="000000"/>
           <w:sz w:val="28"/>
           <w:szCs w:val="28"/>
         </w:rPr>
@@ -30,8 +25,6 @@
       <w:proofErr w:type="spellStart"/>
       <w:r>
         <w:rPr>
-          <w:rFonts w:ascii="Times New Roman" w:hAnsi="Times New Roman"/>
-          <w:color w:val="000000"/>
           <w:sz w:val="28"/>
           <w:szCs w:val="28"/>
         </w:rPr>
@@ -40,8 +33,6 @@
       <w:proofErr w:type="spellEnd"/>
       <w:r>
         <w:rPr>
-          <w:rFonts w:ascii="Times New Roman" w:hAnsi="Times New Roman"/>
-          <w:color w:val="000000"/>
           <w:sz w:val="28"/>
           <w:szCs w:val="28"/>
         </w:rPr>
@@ -50,8 +41,6 @@
       <w:proofErr w:type="spellStart"/>
       <w:r>
         <w:rPr>
-          <w:rFonts w:ascii="Times New Roman" w:hAnsi="Times New Roman"/>
-          <w:color w:val="000000"/>
           <w:sz w:val="28"/>
           <w:szCs w:val="28"/>
         </w:rPr>
@@ -60,8 +49,6 @@
       <w:proofErr w:type="spellEnd"/>
       <w:r>
         <w:rPr>
-          <w:rFonts w:ascii="Times New Roman" w:hAnsi="Times New Roman"/>
-          <w:color w:val="000000"/>
           <w:sz w:val="28"/>
           <w:szCs w:val="28"/>
         </w:rPr>
@@ -70,8 +57,6 @@
       <w:proofErr w:type="spellStart"/>
       <w:r>
         <w:rPr>
-          <w:rFonts w:ascii="Times New Roman" w:hAnsi="Times New Roman"/>
-          <w:color w:val="000000"/>
           <w:sz w:val="28"/>
           <w:szCs w:val="28"/>
         </w:rPr>
@@ -82,13 +67,10 @@
     <w:p>
       <w:pPr>
         <w:jc w:val="center"/>
-        <w:widowControl/>
-      </w:pPr>
-      <w:proofErr w:type="spellStart"/>
-      <w:r>
-        <w:rPr>
-          <w:rFonts w:ascii="Times New Roman" w:hAnsi="Times New Roman"/>
-          <w:color w:val="000000"/>
+      </w:pPr>
+      <w:proofErr w:type="spellStart"/>
+      <w:r>
+        <w:rPr>
           <w:sz w:val="28"/>
           <w:szCs w:val="28"/>
         </w:rPr>
@@ -97,8 +79,6 @@
       <w:proofErr w:type="spellEnd"/>
       <w:r>
         <w:rPr>
-          <w:rFonts w:ascii="Times New Roman" w:hAnsi="Times New Roman"/>
-          <w:color w:val="000000"/>
           <w:sz w:val="28"/>
           <w:szCs w:val="28"/>
         </w:rPr>
@@ -107,8 +87,6 @@
       <w:proofErr w:type="spellStart"/>
       <w:r>
         <w:rPr>
-          <w:rFonts w:ascii="Times New Roman" w:hAnsi="Times New Roman"/>
-          <w:color w:val="000000"/>
           <w:sz w:val="28"/>
           <w:szCs w:val="28"/>
         </w:rPr>
@@ -119,12 +97,9 @@
     <w:p>
       <w:pPr>
         <w:jc w:val="center"/>
-        <w:widowControl/>
-      </w:pPr>
-      <w:r>
-        <w:rPr>
-          <w:rFonts w:ascii="Times New Roman" w:hAnsi="Times New Roman"/>
-          <w:color w:val="000000"/>
+      </w:pPr>
+      <w:r>
+        <w:rPr>
           <w:sz w:val="28"/>
           <w:szCs w:val="28"/>
         </w:rPr>
@@ -133,8 +108,6 @@
       <w:proofErr w:type="spellStart"/>
       <w:r>
         <w:rPr>
-          <w:rFonts w:ascii="Times New Roman" w:hAnsi="Times New Roman"/>
-          <w:color w:val="000000"/>
           <w:sz w:val="28"/>
           <w:szCs w:val="28"/>
         </w:rPr>
@@ -145,22 +118,18 @@
     <w:p>
       <w:pPr>
         <w:spacing w:before="3402"/>
-        <w:widowControl/>
       </w:pPr>
     </w:p>
     <w:p>
       <w:pPr>
         <w:spacing w:after="120"/>
         <w:jc w:val="center"/>
-        <w:widowControl/>
-      </w:pPr>
-      <w:proofErr w:type="spellStart"/>
-      <w:r>
-        <w:rPr>
-          <w:rFonts w:ascii="Times New Roman" w:hAnsi="Times New Roman"/>
+      </w:pPr>
+      <w:proofErr w:type="spellStart"/>
+      <w:r>
+        <w:rPr>
           <w:b/>
           <w:bCs/>
-          <w:color w:val="000000"/>
           <w:sz w:val="32"/>
           <w:szCs w:val="32"/>
         </w:rPr>
@@ -169,10 +138,8 @@
       <w:proofErr w:type="spellEnd"/>
       <w:r>
         <w:rPr>
-          <w:rFonts w:ascii="Times New Roman" w:hAnsi="Times New Roman"/>
           <w:b/>
           <w:bCs/>
-          <w:color w:val="000000"/>
           <w:sz w:val="32"/>
           <w:szCs w:val="32"/>
         </w:rPr>
@@ -182,13 +149,10 @@
     <w:p>
       <w:pPr>
         <w:jc w:val="center"/>
-        <w:widowControl/>
-      </w:pPr>
-      <w:proofErr w:type="spellStart"/>
-      <w:r>
-        <w:rPr>
-          <w:rFonts w:ascii="Times New Roman" w:hAnsi="Times New Roman"/>
-          <w:color w:val="000000"/>
+      </w:pPr>
+      <w:proofErr w:type="spellStart"/>
+      <w:r>
+        <w:rPr>
           <w:sz w:val="32"/>
           <w:szCs w:val="32"/>
         </w:rPr>
@@ -199,7 +163,6 @@
     <w:p>
       <w:pPr>
         <w:spacing w:before="4535"/>
-        <w:widowControl/>
       </w:pPr>
     </w:p>
     <w:tbl>
@@ -227,12 +190,6 @@
         <w:gridCol w:w="1417"/>
       </w:tblGrid>
       <w:tr>
-        <w:tblPrEx>
-          <w:tblCellMar>
-            <w:top w:w="0" w:type="dxa"/>
-            <w:bottom w:w="0" w:type="dxa"/>
-          </w:tblCellMar>
-        </w:tblPrEx>
         <w:trPr>
           <w:trHeight w:hRule="exact" w:val="850"/>
         </w:trPr>
@@ -253,13 +210,9 @@
             </w:tcMar>
           </w:tcPr>
           <w:p>
-            <w:pPr>
-              <w:widowControl/>
-            </w:pPr>
             <w:r>
               <w:rPr>
-                <w:rFonts w:ascii="Times New Roman" w:eastAsia="Arial" w:hAnsi="Times New Roman" w:cs="Arial"/>
-                <w:color w:val="000000"/>
+                <w:rFonts w:ascii="Arial" w:eastAsia="Arial" w:hAnsi="Arial" w:cs="Arial"/>
                 <w:sz w:val="17"/>
                 <w:szCs w:val="17"/>
               </w:rPr>
@@ -270,12 +223,9 @@
             <w:pPr>
               <w:spacing w:before="60"/>
               <w:jc w:val="center"/>
-              <w:widowControl/>
             </w:pPr>
             <w:r>
               <w:rPr>
-                <w:rFonts w:ascii="Times New Roman" w:hAnsi="Times New Roman"/>
-                <w:color w:val="000000"/>
                 <w:sz w:val="20"/>
                 <w:szCs w:val="20"/>
               </w:rPr>
@@ -284,8 +234,6 @@
             <w:proofErr w:type="spellStart"/>
             <w:r>
               <w:rPr>
-                <w:rFonts w:ascii="Times New Roman" w:hAnsi="Times New Roman"/>
-                <w:color w:val="000000"/>
                 <w:sz w:val="20"/>
                 <w:szCs w:val="20"/>
               </w:rPr>
@@ -294,8 +242,6 @@
             <w:proofErr w:type="spellEnd"/>
             <w:r>
               <w:rPr>
-                <w:rFonts w:ascii="Times New Roman" w:hAnsi="Times New Roman"/>
-                <w:color w:val="000000"/>
                 <w:sz w:val="20"/>
                 <w:szCs w:val="20"/>
               </w:rPr>
@@ -320,13 +266,9 @@
             </w:tcMar>
           </w:tcPr>
           <w:p>
-            <w:pPr>
-              <w:widowControl/>
-            </w:pPr>
             <w:r>
               <w:rPr>
-                <w:rFonts w:ascii="Times New Roman" w:eastAsia="Arial" w:hAnsi="Times New Roman" w:cs="Arial"/>
-                <w:color w:val="000000"/>
+                <w:rFonts w:ascii="Arial" w:eastAsia="Arial" w:hAnsi="Arial" w:cs="Arial"/>
                 <w:sz w:val="17"/>
                 <w:szCs w:val="17"/>
               </w:rPr>
@@ -337,12 +279,9 @@
             <w:pPr>
               <w:spacing w:before="60"/>
               <w:jc w:val="center"/>
-              <w:widowControl/>
             </w:pPr>
             <w:r>
               <w:rPr>
-                <w:rFonts w:ascii="Times New Roman" w:hAnsi="Times New Roman"/>
-                <w:color w:val="000000"/>
                 <w:sz w:val="20"/>
                 <w:szCs w:val="20"/>
               </w:rPr>
@@ -371,13 +310,10 @@
           <w:p>
             <w:pPr>
               <w:jc w:val="center"/>
-              <w:widowControl/>
-              <w:widowControl/>
             </w:pPr>
             <w:r>
               <w:rPr>
-                <w:rFonts w:ascii="Times New Roman" w:eastAsia="Arial" w:hAnsi="Times New Roman" w:cs="Arial"/>
-                <w:color w:val="000000"/>
+                <w:rFonts w:ascii="Arial" w:eastAsia="Arial" w:hAnsi="Arial" w:cs="Arial"/>
                 <w:sz w:val="16"/>
                 <w:szCs w:val="16"/>
               </w:rPr>
@@ -387,13 +323,10 @@
           <w:p>
             <w:pPr>
               <w:jc w:val="center"/>
-              <w:widowControl/>
-              <w:widowControl/>
             </w:pPr>
             <w:r>
               <w:rPr>
-                <w:rFonts w:ascii="Times New Roman" w:eastAsia="Arial" w:hAnsi="Times New Roman" w:cs="Arial"/>
-                <w:color w:val="000000"/>
+                <w:rFonts w:ascii="Arial" w:eastAsia="Arial" w:hAnsi="Arial" w:cs="Arial"/>
                 <w:sz w:val="16"/>
                 <w:szCs w:val="16"/>
               </w:rPr>
@@ -403,13 +336,10 @@
           <w:p>
             <w:pPr>
               <w:jc w:val="center"/>
-              <w:widowControl/>
-              <w:widowControl/>
             </w:pPr>
             <w:r>
               <w:rPr>
-                <w:rFonts w:ascii="Times New Roman" w:eastAsia="Arial" w:hAnsi="Times New Roman" w:cs="Arial"/>
-                <w:color w:val="000000"/>
+                <w:rFonts w:ascii="Arial" w:eastAsia="Arial" w:hAnsi="Arial" w:cs="Arial"/>
                 <w:sz w:val="16"/>
                 <w:szCs w:val="16"/>
               </w:rPr>
@@ -419,13 +349,10 @@
           <w:p>
             <w:pPr>
               <w:jc w:val="center"/>
-              <w:widowControl/>
-              <w:widowControl/>
             </w:pPr>
             <w:r>
               <w:rPr>
-                <w:rFonts w:ascii="Times New Roman" w:eastAsia="Arial" w:hAnsi="Times New Roman" w:cs="Arial"/>
-                <w:color w:val="000000"/>
+                <w:rFonts w:ascii="Arial" w:eastAsia="Arial" w:hAnsi="Arial" w:cs="Arial"/>
                 <w:sz w:val="16"/>
                 <w:szCs w:val="16"/>
               </w:rPr>
@@ -434,8 +361,7 @@
             <w:proofErr w:type="gramStart"/>
             <w:r>
               <w:rPr>
-                <w:rFonts w:ascii="Times New Roman" w:eastAsia="Arial" w:hAnsi="Times New Roman" w:cs="Arial"/>
-                <w:color w:val="000000"/>
+                <w:rFonts w:ascii="Arial" w:eastAsia="Arial" w:hAnsi="Arial" w:cs="Arial"/>
                 <w:sz w:val="16"/>
                 <w:szCs w:val="16"/>
               </w:rPr>
@@ -446,12 +372,6 @@
         </w:tc>
       </w:tr>
       <w:tr>
-        <w:tblPrEx>
-          <w:tblCellMar>
-            <w:top w:w="0" w:type="dxa"/>
-            <w:bottom w:w="0" w:type="dxa"/>
-          </w:tblCellMar>
-        </w:tblPrEx>
         <w:trPr>
           <w:trHeight w:hRule="exact" w:val="340"/>
         </w:trPr>
@@ -474,22 +394,9 @@
             </w:tcMar>
           </w:tcPr>
           <w:p>
-            <w:pPr>
-              <w:widowControl/>
-              <w:widowControl/>
-              <w:widowControl/>
-              <w:widowControl/>
-              <w:widowControl/>
-              <w:widowControl/>
-              <w:widowControl/>
-              <w:widowControl/>
-              <w:widowControl/>
-              <w:widowControl/>
-            </w:pPr>
             <w:r>
               <w:rPr>
-                <w:rFonts w:ascii="Times New Roman" w:eastAsia="Arial" w:hAnsi="Times New Roman" w:cs="Arial"/>
-                <w:color w:val="000000"/>
+                <w:rFonts w:ascii="Arial" w:eastAsia="Arial" w:hAnsi="Arial" w:cs="Arial"/>
                 <w:sz w:val="17"/>
                 <w:szCs w:val="17"/>
               </w:rPr>
@@ -500,21 +407,10 @@
             <w:pPr>
               <w:spacing w:before="320"/>
               <w:jc w:val="center"/>
-              <w:widowControl/>
-              <w:widowControl/>
-              <w:widowControl/>
-              <w:widowControl/>
-              <w:widowControl/>
-              <w:widowControl/>
-              <w:widowControl/>
-              <w:widowControl/>
-              <w:widowControl/>
-              <w:widowControl/>
             </w:pPr>
             <w:r>
               <w:rPr>
-                <w:rFonts w:ascii="Times New Roman" w:eastAsia="Arial" w:hAnsi="Times New Roman" w:cs="Arial"/>
-                <w:color w:val="000000"/>
+                <w:rFonts w:ascii="Arial" w:eastAsia="Arial" w:hAnsi="Arial" w:cs="Arial"/>
                 <w:sz w:val="44"/>
                 <w:szCs w:val="44"/>
               </w:rPr>
@@ -540,13 +436,9 @@
             <w:vAlign w:val="center"/>
           </w:tcPr>
           <w:p>
-            <w:pPr>
-              <w:widowControl/>
-            </w:pPr>
             <w:r>
               <w:rPr>
-                <w:rFonts w:ascii="Times New Roman" w:eastAsia="Arial" w:hAnsi="Times New Roman" w:cs="Arial"/>
-                <w:color w:val="000000"/>
+                <w:rFonts w:ascii="Arial" w:eastAsia="Arial" w:hAnsi="Arial" w:cs="Arial"/>
                 <w:sz w:val="17"/>
                 <w:szCs w:val="17"/>
               </w:rPr>
@@ -574,12 +466,9 @@
           <w:p>
             <w:pPr>
               <w:jc w:val="center"/>
-              <w:widowControl/>
             </w:pPr>
             <w:r>
               <w:rPr>
-                <w:rFonts w:ascii="Times New Roman" w:hAnsi="Times New Roman"/>
-                <w:color w:val="000000"/>
                 <w:sz w:val="20"/>
                 <w:szCs w:val="20"/>
               </w:rPr>
@@ -589,12 +478,6 @@
         </w:tc>
       </w:tr>
       <w:tr>
-        <w:tblPrEx>
-          <w:tblCellMar>
-            <w:top w:w="0" w:type="dxa"/>
-            <w:bottom w:w="0" w:type="dxa"/>
-          </w:tblCellMar>
-        </w:tblPrEx>
         <w:trPr>
           <w:trHeight w:hRule="exact" w:val="340"/>
         </w:trPr>
@@ -630,13 +513,9 @@
             <w:vAlign w:val="center"/>
           </w:tcPr>
           <w:p>
-            <w:pPr>
-              <w:widowControl/>
-            </w:pPr>
             <w:r>
               <w:rPr>
-                <w:rFonts w:ascii="Times New Roman" w:eastAsia="Arial" w:hAnsi="Times New Roman" w:cs="Arial"/>
-                <w:color w:val="000000"/>
+                <w:rFonts w:ascii="Arial" w:eastAsia="Arial" w:hAnsi="Arial" w:cs="Arial"/>
                 <w:sz w:val="17"/>
                 <w:szCs w:val="17"/>
               </w:rPr>
@@ -666,18 +545,16 @@
               <w:jc w:val="center"/>
             </w:pPr>
             <w:r>
-              <w:t>3</w:t>
+              <w:rPr>
+                <w:sz w:val="20"/>
+                <w:szCs w:val="20"/>
+              </w:rPr>
+              <w:t>4</w:t>
             </w:r>
           </w:p>
         </w:tc>
       </w:tr>
       <w:tr>
-        <w:tblPrEx>
-          <w:tblCellMar>
-            <w:top w:w="0" w:type="dxa"/>
-            <w:bottom w:w="0" w:type="dxa"/>
-          </w:tblCellMar>
-        </w:tblPrEx>
         <w:trPr>
           <w:trHeight w:hRule="exact" w:val="340"/>
         </w:trPr>
@@ -713,13 +590,9 @@
             <w:vAlign w:val="center"/>
           </w:tcPr>
           <w:p>
-            <w:pPr>
-              <w:widowControl/>
-            </w:pPr>
             <w:r>
               <w:rPr>
-                <w:rFonts w:ascii="Times New Roman" w:eastAsia="Arial" w:hAnsi="Times New Roman" w:cs="Arial"/>
-                <w:color w:val="000000"/>
+                <w:rFonts w:ascii="Arial" w:eastAsia="Arial" w:hAnsi="Arial" w:cs="Arial"/>
                 <w:sz w:val="17"/>
                 <w:szCs w:val="17"/>
               </w:rPr>
@@ -749,18 +622,16 @@
               <w:jc w:val="center"/>
             </w:pPr>
             <w:r>
+              <w:rPr>
+                <w:sz w:val="20"/>
+                <w:szCs w:val="20"/>
+              </w:rPr>
               <w:t>1</w:t>
             </w:r>
           </w:p>
         </w:tc>
       </w:tr>
       <w:tr>
-        <w:tblPrEx>
-          <w:tblCellMar>
-            <w:top w:w="0" w:type="dxa"/>
-            <w:bottom w:w="0" w:type="dxa"/>
-          </w:tblCellMar>
-        </w:tblPrEx>
         <w:trPr>
           <w:trHeight w:hRule="exact" w:val="340"/>
         </w:trPr>
@@ -796,13 +667,9 @@
             <w:vAlign w:val="center"/>
           </w:tcPr>
           <w:p>
-            <w:pPr>
-              <w:widowControl/>
-            </w:pPr>
             <w:r>
               <w:rPr>
-                <w:rFonts w:ascii="Times New Roman" w:eastAsia="Arial" w:hAnsi="Times New Roman" w:cs="Arial"/>
-                <w:color w:val="000000"/>
+                <w:rFonts w:ascii="Arial" w:eastAsia="Arial" w:hAnsi="Arial" w:cs="Arial"/>
                 <w:sz w:val="17"/>
                 <w:szCs w:val="17"/>
               </w:rPr>
@@ -830,12 +697,9 @@
           <w:p>
             <w:pPr>
               <w:jc w:val="center"/>
-              <w:widowControl/>
             </w:pPr>
             <w:r>
               <w:rPr>
-                <w:rFonts w:ascii="Times New Roman" w:hAnsi="Times New Roman"/>
-                <w:color w:val="000000"/>
                 <w:sz w:val="20"/>
                 <w:szCs w:val="20"/>
               </w:rPr>
@@ -845,12 +709,6 @@
         </w:tc>
       </w:tr>
       <w:tr>
-        <w:tblPrEx>
-          <w:tblCellMar>
-            <w:top w:w="0" w:type="dxa"/>
-            <w:bottom w:w="0" w:type="dxa"/>
-          </w:tblCellMar>
-        </w:tblPrEx>
         <w:trPr>
           <w:trHeight w:hRule="exact" w:val="340"/>
         </w:trPr>
@@ -886,13 +744,9 @@
             <w:vAlign w:val="center"/>
           </w:tcPr>
           <w:p>
-            <w:pPr>
-              <w:widowControl/>
-            </w:pPr>
             <w:r>
               <w:rPr>
-                <w:rFonts w:ascii="Times New Roman" w:eastAsia="Arial" w:hAnsi="Times New Roman" w:cs="Arial"/>
-                <w:color w:val="000000"/>
+                <w:rFonts w:ascii="Arial" w:eastAsia="Arial" w:hAnsi="Arial" w:cs="Arial"/>
                 <w:sz w:val="17"/>
                 <w:szCs w:val="17"/>
               </w:rPr>
@@ -920,12 +774,9 @@
           <w:p>
             <w:pPr>
               <w:jc w:val="center"/>
-              <w:widowControl/>
             </w:pPr>
             <w:r>
               <w:rPr>
-                <w:rFonts w:ascii="Times New Roman" w:hAnsi="Times New Roman"/>
-                <w:color w:val="000000"/>
                 <w:sz w:val="20"/>
                 <w:szCs w:val="20"/>
               </w:rPr>
@@ -935,12 +786,6 @@
         </w:tc>
       </w:tr>
       <w:tr>
-        <w:tblPrEx>
-          <w:tblCellMar>
-            <w:top w:w="0" w:type="dxa"/>
-            <w:bottom w:w="0" w:type="dxa"/>
-          </w:tblCellMar>
-        </w:tblPrEx>
         <w:trPr>
           <w:trHeight w:hRule="exact" w:val="850"/>
         </w:trPr>
@@ -965,17 +810,13 @@
           <w:p>
             <w:pPr>
               <w:jc w:val="center"/>
-              <w:widowControl/>
-              <w:widowControl/>
             </w:pPr>
             <w:r>
               <w:rPr>
-                <w:rFonts w:ascii="Times New Roman" w:eastAsia="Arial" w:hAnsi="Times New Roman" w:cs="Arial"/>
-                <w:color w:val="000000"/>
+                <w:rFonts w:ascii="Arial" w:eastAsia="Arial" w:hAnsi="Arial" w:cs="Arial"/>
                 <w:sz w:val="36"/>
                 <w:szCs w:val="36"/>
               </w:rPr>
-              <w:lastRenderedPageBreak/>
               <w:t>GEODÉZIA 1</w:t>
             </w:r>
           </w:p>
@@ -997,13 +838,9 @@
             </w:tcMar>
           </w:tcPr>
           <w:p>
-            <w:pPr>
-              <w:widowControl/>
-            </w:pPr>
             <w:r>
               <w:rPr>
-                <w:rFonts w:ascii="Times New Roman" w:eastAsia="Arial" w:hAnsi="Times New Roman" w:cs="Arial"/>
-                <w:color w:val="000000"/>
+                <w:rFonts w:ascii="Arial" w:eastAsia="Arial" w:hAnsi="Arial" w:cs="Arial"/>
                 <w:sz w:val="17"/>
                 <w:szCs w:val="17"/>
               </w:rPr>
@@ -1028,13 +865,9 @@
             </w:tcMar>
           </w:tcPr>
           <w:p>
-            <w:pPr>
-              <w:widowControl/>
-            </w:pPr>
             <w:r>
               <w:rPr>
-                <w:rFonts w:ascii="Times New Roman" w:eastAsia="Arial" w:hAnsi="Times New Roman" w:cs="Arial"/>
-                <w:color w:val="000000"/>
+                <w:rFonts w:ascii="Arial" w:eastAsia="Arial" w:hAnsi="Arial" w:cs="Arial"/>
                 <w:sz w:val="17"/>
                 <w:szCs w:val="17"/>
               </w:rPr>
@@ -1054,171 +887,457 @@
           <w:cols w:space="720"/>
           <w:docGrid w:linePitch="360"/>
         </w:sectPr>
-        <w:widowControl/>
-      </w:pPr>
-    </w:p>
-    <w:p>
-      <w:pPr>
-        <w:pStyle w:val="Title"/>
-        <w:spacing w:after="100" w:line="240" w:lineRule="auto"/>
+      </w:pPr>
+    </w:p>
+    <w:p>
+      <w:pPr>
+        <w:spacing w:after="360"/>
         <w:jc w:val="center"/>
       </w:pPr>
-      <w:r>
-        <w:rPr>
-          <w:rFonts w:ascii="Times New Roman" w:hAnsi="Times New Roman"/>
+      <w:proofErr w:type="spellStart"/>
+      <w:r>
+        <w:rPr>
           <w:b/>
-          <w:color w:val="000000"/>
+          <w:bCs/>
           <w:sz w:val="28"/>
-        </w:rPr>
-        <w:t>Technická správa</w:t>
-      </w:r>
-    </w:p>
-    <w:p>
-      <w:pPr>
-        <w:pStyle w:val="Heading1"/>
+          <w:szCs w:val="28"/>
+        </w:rPr>
+        <w:lastRenderedPageBreak/>
+        <w:t>Technická</w:t>
+      </w:r>
+      <w:proofErr w:type="spellEnd"/>
+      <w:r>
+        <w:rPr>
+          <w:b/>
+          <w:bCs/>
+          <w:sz w:val="28"/>
+          <w:szCs w:val="28"/>
+        </w:rPr>
+        <w:t xml:space="preserve"> </w:t>
+      </w:r>
+      <w:proofErr w:type="spellStart"/>
+      <w:r>
+        <w:rPr>
+          <w:b/>
+          <w:bCs/>
+          <w:sz w:val="28"/>
+          <w:szCs w:val="28"/>
+        </w:rPr>
+        <w:t>správa</w:t>
+      </w:r>
+      <w:proofErr w:type="spellEnd"/>
+    </w:p>
+    <w:p>
+      <w:pPr>
         <w:keepNext/>
-        <w:spacing w:after="100" w:line="240" w:lineRule="auto" w:before="120"/>
-      </w:pPr>
-      <w:r>
-        <w:rPr>
-          <w:rFonts w:ascii="Times New Roman" w:hAnsi="Times New Roman"/>
+        <w:spacing w:before="240" w:after="120"/>
+      </w:pPr>
+      <w:proofErr w:type="gramStart"/>
+      <w:r>
+        <w:rPr>
           <w:b/>
-          <w:color w:val="000000"/>
-          <w:sz w:val="24"/>
-        </w:rPr>
-        <w:t>1  Definícia úlohy</w:t>
-      </w:r>
-    </w:p>
-    <w:p>
-      <w:pPr>
-        <w:spacing w:after="100" w:line="240" w:lineRule="auto"/>
-      </w:pPr>
-      <w:r>
-        <w:rPr>
-          <w:rFonts w:ascii="Times New Roman" w:hAnsi="Times New Roman"/>
-          <w:b w:val="0"/>
-          <w:color w:val="000000"/>
-          <w:sz w:val="24"/>
-        </w:rPr>
-        <w:t>Cieľom úlohy bolo pripraviť ďalekohľad na meranie, odčítať dva vodorovné smery v I. polohe ďalekohľadu a precvičiť centráciu a horizontáciu v teréne.</w:t>
-      </w:r>
-    </w:p>
-    <w:p>
-      <w:pPr>
-        <w:pStyle w:val="Heading1"/>
+          <w:bCs/>
+        </w:rPr>
+        <w:t xml:space="preserve">1  </w:t>
+      </w:r>
+      <w:proofErr w:type="spellStart"/>
+      <w:r>
+        <w:rPr>
+          <w:b/>
+          <w:bCs/>
+        </w:rPr>
+        <w:t>Definícia</w:t>
+      </w:r>
+      <w:proofErr w:type="spellEnd"/>
+      <w:proofErr w:type="gramEnd"/>
+      <w:r>
+        <w:rPr>
+          <w:b/>
+          <w:bCs/>
+        </w:rPr>
+        <w:t xml:space="preserve"> </w:t>
+      </w:r>
+      <w:proofErr w:type="spellStart"/>
+      <w:r>
+        <w:rPr>
+          <w:b/>
+          <w:bCs/>
+        </w:rPr>
+        <w:t>úlohy</w:t>
+      </w:r>
+      <w:proofErr w:type="spellEnd"/>
+    </w:p>
+    <w:p>
+      <w:pPr>
+        <w:spacing w:after="120"/>
+      </w:pPr>
+      <w:r>
+        <w:rPr>
+          <w:color w:val="000000"/>
+        </w:rPr>
+        <w:t xml:space="preserve">Cieľom </w:t>
+      </w:r>
+      <w:proofErr w:type="spellStart"/>
+      <w:r>
+        <w:rPr>
+          <w:color w:val="000000"/>
+        </w:rPr>
+        <w:t>úlohy</w:t>
+      </w:r>
+      <w:proofErr w:type="spellEnd"/>
+      <w:r>
+        <w:rPr>
+          <w:color w:val="000000"/>
+        </w:rPr>
+        <w:t xml:space="preserve"> bolo </w:t>
+      </w:r>
+      <w:proofErr w:type="spellStart"/>
+      <w:r>
+        <w:rPr>
+          <w:color w:val="000000"/>
+        </w:rPr>
+        <w:t>pripraviť</w:t>
+      </w:r>
+      <w:proofErr w:type="spellEnd"/>
+      <w:r>
+        <w:rPr>
+          <w:color w:val="000000"/>
+        </w:rPr>
+        <w:t xml:space="preserve"> </w:t>
+      </w:r>
+      <w:proofErr w:type="spellStart"/>
+      <w:r>
+        <w:rPr>
+          <w:color w:val="000000"/>
+        </w:rPr>
+        <w:t>pristroj</w:t>
+      </w:r>
+      <w:proofErr w:type="spellEnd"/>
+      <w:r>
+        <w:rPr>
+          <w:color w:val="000000"/>
+        </w:rPr>
+        <w:t xml:space="preserve"> </w:t>
+      </w:r>
+      <w:proofErr w:type="spellStart"/>
+      <w:r>
+        <w:rPr>
+          <w:color w:val="000000"/>
+        </w:rPr>
+        <w:t>na</w:t>
+      </w:r>
+      <w:proofErr w:type="spellEnd"/>
+      <w:r>
+        <w:rPr>
+          <w:color w:val="000000"/>
+        </w:rPr>
+        <w:t xml:space="preserve"> </w:t>
+      </w:r>
+      <w:proofErr w:type="spellStart"/>
+      <w:r>
+        <w:rPr>
+          <w:color w:val="000000"/>
+        </w:rPr>
+        <w:t>meranie</w:t>
+      </w:r>
+      <w:proofErr w:type="spellEnd"/>
+      <w:r>
+        <w:rPr>
+          <w:color w:val="000000"/>
+        </w:rPr>
+        <w:t xml:space="preserve">, </w:t>
+      </w:r>
+      <w:proofErr w:type="spellStart"/>
+      <w:r>
+        <w:rPr>
+          <w:color w:val="000000"/>
+        </w:rPr>
+        <w:t>odčítať</w:t>
+      </w:r>
+      <w:proofErr w:type="spellEnd"/>
+      <w:r>
+        <w:rPr>
+          <w:color w:val="000000"/>
+        </w:rPr>
+        <w:t xml:space="preserve"> dva vodorovné smery v I. polohe ďalekohľadu a precvičiť centráciu a horizontáciu v teréne.</w:t>
+      </w:r>
+    </w:p>
+    <w:p>
+      <w:pPr>
         <w:keepNext/>
-        <w:spacing w:after="100" w:line="240" w:lineRule="auto" w:before="120"/>
-      </w:pPr>
-      <w:r>
-        <w:rPr>
-          <w:rFonts w:ascii="Times New Roman" w:hAnsi="Times New Roman"/>
+        <w:spacing w:before="240" w:after="120"/>
+      </w:pPr>
+      <w:proofErr w:type="gramStart"/>
+      <w:r>
+        <w:rPr>
           <w:b/>
-          <w:color w:val="000000"/>
-          <w:sz w:val="24"/>
-        </w:rPr>
-        <w:t>2  Postup merania</w:t>
-      </w:r>
-    </w:p>
-    <w:p>
-      <w:pPr>
-        <w:spacing w:after="100" w:line="240" w:lineRule="auto"/>
-      </w:pPr>
-      <w:r>
-        <w:rPr>
-          <w:rFonts w:ascii="Times New Roman" w:hAnsi="Times New Roman"/>
-          <w:b w:val="0"/>
-          <w:color w:val="000000"/>
-          <w:sz w:val="24"/>
-        </w:rPr>
-        <w:t>Na prvom cvičení sme pracovali s prístrojmi Zeiss Theo 020A a Zeiss Theo 010A. Prístroj sme postavili na pilier, upevnili skrutkou a vybrali si dva body. Pri Theo 020A sme v stupnicovom mikroskope odčítali na bod 1001 smer 65,3205</w:t>
-      </w:r>
-      <w:r>
-        <w:rPr>
-          <w:rFonts w:ascii="Times New Roman" w:hAnsi="Times New Roman"/>
-          <w:b w:val="0"/>
-          <w:color w:val="000000"/>
-          <w:sz w:val="24"/>
+          <w:bCs/>
+        </w:rPr>
+        <w:t xml:space="preserve">2  </w:t>
+      </w:r>
+      <w:proofErr w:type="spellStart"/>
+      <w:r>
+        <w:rPr>
+          <w:b/>
+          <w:bCs/>
+        </w:rPr>
+        <w:t>Postup</w:t>
+      </w:r>
+      <w:proofErr w:type="spellEnd"/>
+      <w:proofErr w:type="gramEnd"/>
+      <w:r>
+        <w:rPr>
+          <w:b/>
+          <w:bCs/>
+        </w:rPr>
+        <w:t xml:space="preserve"> </w:t>
+      </w:r>
+      <w:proofErr w:type="spellStart"/>
+      <w:r>
+        <w:rPr>
+          <w:b/>
+          <w:bCs/>
+        </w:rPr>
+        <w:t>merania</w:t>
+      </w:r>
+      <w:proofErr w:type="spellEnd"/>
+    </w:p>
+    <w:p>
+      <w:pPr>
+        <w:spacing w:after="120"/>
+      </w:pPr>
+      <w:r>
+        <w:rPr>
+          <w:color w:val="000000"/>
+        </w:rPr>
+        <w:t xml:space="preserve">Na prvom cvičení sme pracovali s prístrojmi Zeiss Theo 020A a Zeiss Theo 010A. Prístroj sme postavili na </w:t>
+      </w:r>
+      <w:proofErr w:type="spellStart"/>
+      <w:r>
+        <w:rPr>
+          <w:color w:val="000000"/>
+        </w:rPr>
+        <w:t>pilier</w:t>
+      </w:r>
+      <w:proofErr w:type="spellEnd"/>
+      <w:r>
+        <w:rPr>
+          <w:color w:val="000000"/>
+        </w:rPr>
+        <w:t xml:space="preserve">, </w:t>
+      </w:r>
+      <w:proofErr w:type="spellStart"/>
+      <w:r>
+        <w:rPr>
+          <w:color w:val="000000"/>
+        </w:rPr>
+        <w:t>upevnili</w:t>
+      </w:r>
+      <w:proofErr w:type="spellEnd"/>
+      <w:r>
+        <w:rPr>
+          <w:color w:val="000000"/>
+        </w:rPr>
+        <w:t xml:space="preserve"> </w:t>
+      </w:r>
+      <w:proofErr w:type="spellStart"/>
+      <w:r>
+        <w:rPr>
+          <w:color w:val="000000"/>
+        </w:rPr>
+        <w:t>skrutkou</w:t>
+      </w:r>
+      <w:proofErr w:type="spellEnd"/>
+      <w:r>
+        <w:rPr>
+          <w:color w:val="000000"/>
+        </w:rPr>
+        <w:t xml:space="preserve"> a</w:t>
+      </w:r>
+      <w:r>
+        <w:rPr>
+          <w:color w:val="000000"/>
+        </w:rPr>
+        <w:t xml:space="preserve"> </w:t>
+      </w:r>
+      <w:proofErr w:type="spellStart"/>
+      <w:r>
+        <w:rPr>
+          <w:color w:val="000000"/>
+        </w:rPr>
+        <w:t>zhorizontovali</w:t>
+      </w:r>
+      <w:proofErr w:type="spellEnd"/>
+      <w:r>
+        <w:rPr>
+          <w:color w:val="000000"/>
+        </w:rPr>
+        <w:t xml:space="preserve"> </w:t>
+      </w:r>
+      <w:proofErr w:type="spellStart"/>
+      <w:r>
+        <w:rPr>
+          <w:color w:val="000000"/>
+        </w:rPr>
+        <w:t>pomocou</w:t>
+      </w:r>
+      <w:proofErr w:type="spellEnd"/>
+      <w:r>
+        <w:rPr>
+          <w:color w:val="000000"/>
+        </w:rPr>
+        <w:t xml:space="preserve"> </w:t>
+      </w:r>
+      <w:proofErr w:type="spellStart"/>
+      <w:r>
+        <w:rPr>
+          <w:color w:val="000000"/>
+        </w:rPr>
+        <w:t>dostredovacich</w:t>
+      </w:r>
+      <w:proofErr w:type="spellEnd"/>
+      <w:r>
+        <w:rPr>
+          <w:color w:val="000000"/>
+        </w:rPr>
+        <w:t xml:space="preserve"> </w:t>
+      </w:r>
+      <w:proofErr w:type="spellStart"/>
+      <w:r>
+        <w:rPr>
+          <w:color w:val="000000"/>
+        </w:rPr>
+        <w:t>skrutiek</w:t>
+      </w:r>
+      <w:proofErr w:type="spellEnd"/>
+      <w:r>
+        <w:rPr>
+          <w:color w:val="000000"/>
+        </w:rPr>
+        <w:t>,</w:t>
+      </w:r>
+      <w:r>
+        <w:rPr>
+          <w:color w:val="000000"/>
+        </w:rPr>
+        <w:t xml:space="preserve"> </w:t>
+      </w:r>
+      <w:proofErr w:type="spellStart"/>
+      <w:r>
+        <w:rPr>
+          <w:color w:val="000000"/>
+        </w:rPr>
+        <w:t>vybrali</w:t>
+      </w:r>
+      <w:proofErr w:type="spellEnd"/>
+      <w:r>
+        <w:rPr>
+          <w:color w:val="000000"/>
+        </w:rPr>
+        <w:t xml:space="preserve"> </w:t>
+      </w:r>
+      <w:proofErr w:type="spellStart"/>
+      <w:r>
+        <w:rPr>
+          <w:color w:val="000000"/>
+        </w:rPr>
+        <w:t>sme</w:t>
+      </w:r>
+      <w:proofErr w:type="spellEnd"/>
+      <w:r>
+        <w:rPr>
+          <w:color w:val="000000"/>
+        </w:rPr>
+        <w:t xml:space="preserve"> </w:t>
+      </w:r>
+      <w:proofErr w:type="spellStart"/>
+      <w:r>
+        <w:rPr>
+          <w:color w:val="000000"/>
+        </w:rPr>
+        <w:t>si</w:t>
+      </w:r>
+      <w:proofErr w:type="spellEnd"/>
+      <w:r>
+        <w:rPr>
+          <w:color w:val="000000"/>
+        </w:rPr>
+        <w:t xml:space="preserve"> </w:t>
+      </w:r>
+      <w:proofErr w:type="spellStart"/>
+      <w:r>
+        <w:rPr>
+          <w:color w:val="000000"/>
+        </w:rPr>
+        <w:t>dva</w:t>
+      </w:r>
+      <w:proofErr w:type="spellEnd"/>
+      <w:r>
+        <w:rPr>
+          <w:color w:val="000000"/>
+        </w:rPr>
+        <w:t xml:space="preserve"> body. Pri Theo 020A sme v stupnicovom mikroskope odčítali na bod 1001 smer 65,3205</w:t>
+      </w:r>
+      <w:r>
+        <w:rPr>
+          <w:color w:val="000000"/>
           <w:vertAlign w:val="superscript"/>
         </w:rPr>
         <w:t>g</w:t>
       </w:r>
       <w:r>
         <w:rPr>
-          <w:rFonts w:ascii="Times New Roman" w:hAnsi="Times New Roman"/>
-          <w:b w:val="0"/>
-          <w:color w:val="000000"/>
-          <w:sz w:val="24"/>
+          <w:color w:val="000000"/>
         </w:rPr>
         <w:t xml:space="preserve"> a na bod 1002 smer 66,6505</w:t>
       </w:r>
       <w:r>
         <w:rPr>
-          <w:rFonts w:ascii="Times New Roman" w:hAnsi="Times New Roman"/>
-          <w:b w:val="0"/>
-          <w:color w:val="000000"/>
-          <w:sz w:val="24"/>
+          <w:color w:val="000000"/>
           <w:vertAlign w:val="superscript"/>
         </w:rPr>
         <w:t>g</w:t>
       </w:r>
       <w:r>
         <w:rPr>
-          <w:rFonts w:ascii="Times New Roman" w:hAnsi="Times New Roman"/>
-          <w:b w:val="0"/>
-          <w:color w:val="000000"/>
-          <w:sz w:val="24"/>
+          <w:color w:val="000000"/>
         </w:rPr>
         <w:t xml:space="preserve"> (obr. 1).</w:t>
       </w:r>
     </w:p>
     <w:p>
       <w:pPr>
-        <w:spacing w:after="100" w:line="240" w:lineRule="auto"/>
-      </w:pPr>
-      <w:r>
-        <w:rPr>
-          <w:rFonts w:ascii="Times New Roman" w:hAnsi="Times New Roman"/>
-          <w:b w:val="0"/>
-          <w:color w:val="000000"/>
-          <w:sz w:val="24"/>
+        <w:spacing w:after="120"/>
+      </w:pPr>
+      <w:r>
+        <w:rPr>
+          <w:color w:val="000000"/>
         </w:rPr>
         <w:t>Pri Theo 010A sme koincidenčnou skrutkou zarovnali čiarky v spodnom okienku. Potom sme odčítali celé grády, desatiny a zvyšok na mikrometri. Na bod 1003 sme namerali 229,5304</w:t>
       </w:r>
       <w:r>
         <w:rPr>
-          <w:rFonts w:ascii="Times New Roman" w:hAnsi="Times New Roman"/>
-          <w:b w:val="0"/>
-          <w:color w:val="000000"/>
-          <w:sz w:val="24"/>
+          <w:color w:val="000000"/>
           <w:vertAlign w:val="superscript"/>
         </w:rPr>
         <w:t>g</w:t>
       </w:r>
       <w:r>
         <w:rPr>
-          <w:rFonts w:ascii="Times New Roman" w:hAnsi="Times New Roman"/>
-          <w:b w:val="0"/>
-          <w:color w:val="000000"/>
-          <w:sz w:val="24"/>
+          <w:color w:val="000000"/>
         </w:rPr>
         <w:t xml:space="preserve"> a na bod 1004 smer 234,4304</w:t>
       </w:r>
       <w:r>
         <w:rPr>
-          <w:rFonts w:ascii="Times New Roman" w:hAnsi="Times New Roman"/>
-          <w:b w:val="0"/>
-          <w:color w:val="000000"/>
-          <w:sz w:val="24"/>
+          <w:color w:val="000000"/>
           <w:vertAlign w:val="superscript"/>
         </w:rPr>
         <w:t>g</w:t>
       </w:r>
       <w:r>
         <w:rPr>
-          <w:rFonts w:ascii="Times New Roman" w:hAnsi="Times New Roman"/>
-          <w:b w:val="0"/>
-          <w:color w:val="000000"/>
-          <w:sz w:val="24"/>
+          <w:color w:val="000000"/>
         </w:rPr>
         <w:t xml:space="preserve"> (obr. 2).</w:t>
       </w:r>
@@ -1227,35 +1346,31 @@
       <w:pPr>
         <w:keepNext/>
         <w:tabs>
-          <w:tab w:pos="4932" w:val="left"/>
+          <w:tab w:val="left" w:pos="5329"/>
         </w:tabs>
-        <w:spacing w:after="100" w:line="240" w:lineRule="auto"/>
-      </w:pPr>
-      <w:r>
-        <w:rPr>
-          <w:rFonts w:ascii="Times New Roman" w:hAnsi="Times New Roman"/>
-          <w:b w:val="0"/>
-          <w:color w:val="000000"/>
-          <w:sz w:val="24"/>
-        </w:rPr>
-      </w:r>
-      <w:r>
+        <w:spacing w:after="120"/>
+      </w:pPr>
+      <w:r>
+        <w:rPr>
+          <w:noProof/>
+        </w:rPr>
         <w:drawing>
-          <wp:inline xmlns:a="http://schemas.openxmlformats.org/drawingml/2006/main" xmlns:pic="http://schemas.openxmlformats.org/drawingml/2006/picture">
-            <wp:extent cx="2700000" cy="1860300"/>
+          <wp:inline distT="0" distB="0" distL="0" distR="0" wp14:anchorId="5AE906EF" wp14:editId="38BBF13E">
+            <wp:extent cx="2925978" cy="2015999"/>
+            <wp:effectExtent l="0" t="0" r="0" b="0"/>
             <wp:docPr id="1" name="Picture 1"/>
             <wp:cNvGraphicFramePr>
-              <a:graphicFrameLocks noChangeAspect="1"/>
+              <a:graphicFrameLocks xmlns:a="http://schemas.openxmlformats.org/drawingml/2006/main" noChangeAspect="1"/>
             </wp:cNvGraphicFramePr>
-            <a:graphic>
+            <a:graphic xmlns:a="http://schemas.openxmlformats.org/drawingml/2006/main">
               <a:graphicData uri="http://schemas.openxmlformats.org/drawingml/2006/picture">
-                <pic:pic>
+                <pic:pic xmlns:pic="http://schemas.openxmlformats.org/drawingml/2006/picture">
                   <pic:nvPicPr>
-                    <pic:cNvPr id="0" name="image.png"/>
+                    <pic:cNvPr id="0" name="theo020_65_3205g.png"/>
                     <pic:cNvPicPr/>
                   </pic:nvPicPr>
                   <pic:blipFill>
-                    <a:blip r:embed="rId23"/>
+                    <a:blip r:embed="rId9"/>
                     <a:stretch>
                       <a:fillRect/>
                     </a:stretch>
@@ -1263,9 +1378,11 @@
                   <pic:spPr>
                     <a:xfrm>
                       <a:off x="0" y="0"/>
-                      <a:ext cx="2700000" cy="1860300"/>
+                      <a:ext cx="2925978" cy="2015999"/>
                     </a:xfrm>
-                    <a:prstGeom prst="rect"/>
+                    <a:prstGeom prst="rect">
+                      <a:avLst/>
+                    </a:prstGeom>
                   </pic:spPr>
                 </pic:pic>
               </a:graphicData>
@@ -1274,25 +1391,32 @@
         </w:drawing>
       </w:r>
       <w:r>
+        <w:t xml:space="preserve">                   </w:t>
+      </w:r>
+      <w:r>
         <w:tab/>
       </w:r>
       <w:r>
+        <w:rPr>
+          <w:noProof/>
+        </w:rPr>
         <w:drawing>
-          <wp:inline xmlns:a="http://schemas.openxmlformats.org/drawingml/2006/main" xmlns:pic="http://schemas.openxmlformats.org/drawingml/2006/picture">
-            <wp:extent cx="2196000" cy="2196000"/>
+          <wp:inline distT="0" distB="0" distL="0" distR="0" wp14:anchorId="1D229903" wp14:editId="5354D87D">
+            <wp:extent cx="2015999" cy="2015999"/>
+            <wp:effectExtent l="0" t="0" r="0" b="0"/>
             <wp:docPr id="2" name="Picture 2"/>
             <wp:cNvGraphicFramePr>
-              <a:graphicFrameLocks noChangeAspect="1"/>
+              <a:graphicFrameLocks xmlns:a="http://schemas.openxmlformats.org/drawingml/2006/main" noChangeAspect="1"/>
             </wp:cNvGraphicFramePr>
-            <a:graphic>
+            <a:graphic xmlns:a="http://schemas.openxmlformats.org/drawingml/2006/main">
               <a:graphicData uri="http://schemas.openxmlformats.org/drawingml/2006/picture">
-                <pic:pic>
+                <pic:pic xmlns:pic="http://schemas.openxmlformats.org/drawingml/2006/picture">
                   <pic:nvPicPr>
-                    <pic:cNvPr id="0" name="image.png"/>
+                    <pic:cNvPr id="0" name="codex-clipboard-8880ff90-a84b-404c-9e4d-82234306849b.png"/>
                     <pic:cNvPicPr/>
                   </pic:nvPicPr>
                   <pic:blipFill>
-                    <a:blip r:embed="rId24"/>
+                    <a:blip r:embed="rId10"/>
                     <a:stretch>
                       <a:fillRect/>
                     </a:stretch>
@@ -1300,9 +1424,11 @@
                   <pic:spPr>
                     <a:xfrm>
                       <a:off x="0" y="0"/>
-                      <a:ext cx="2196000" cy="2196000"/>
+                      <a:ext cx="2015999" cy="2015999"/>
                     </a:xfrm>
-                    <a:prstGeom prst="rect"/>
+                    <a:prstGeom prst="rect">
+                      <a:avLst/>
+                    </a:prstGeom>
                   </pic:spPr>
                 </pic:pic>
               </a:graphicData>
@@ -1314,205 +1440,720 @@
     <w:p>
       <w:pPr>
         <w:tabs>
-          <w:tab w:pos="4932" w:val="left"/>
+          <w:tab w:val="center" w:pos="2302"/>
+          <w:tab w:val="center" w:pos="6917"/>
         </w:tabs>
-        <w:spacing w:after="100" w:line="240" w:lineRule="auto"/>
-      </w:pPr>
-      <w:r>
-        <w:rPr>
-          <w:rFonts w:ascii="Times New Roman" w:hAnsi="Times New Roman"/>
-          <w:b w:val="0"/>
+        <w:spacing w:after="120"/>
+      </w:pPr>
+      <w:r>
+        <w:rPr>
           <w:color w:val="000000"/>
           <w:sz w:val="20"/>
         </w:rPr>
-        <w:t>Obr. 1  Odčítanie na Zeiss Theo 020A</w:t>
         <w:tab/>
-        <w:t>Obr. 2  Odčítanie na Zeiss Theo 010A</w:t>
-      </w:r>
-    </w:p>
-    <w:p>
-      <w:pPr>
-        <w:spacing w:after="100" w:line="240" w:lineRule="auto"/>
-      </w:pPr>
-      <w:r>
-        <w:rPr>
-          <w:rFonts w:ascii="Times New Roman" w:hAnsi="Times New Roman"/>
-          <w:b w:val="0"/>
-          <w:color w:val="000000"/>
-          <w:sz w:val="24"/>
-        </w:rPr>
-        <w:t>Na ďalšom cvičení sme na Námestí slobody použili Nivel System DT-2 s optickou olovnicou a Trimble C5 s laserovou olovnicou. Statív sme rozložili nad bod, osadili prístroj a posúvaním nôh ho nahrubo zcentrovali. Dĺžkou nôh sme urovnali kruhovú libelu, potom dostreďovacími skrutkami rúrkovú libelu. Jemnú centráciu sme vykonali posunutím prístroja po hlave statívu. Centráciu a horizontáciu sme kontrolovali a opakovali, kým bol prístroj urovnaný a nad bodom.</w:t>
-      </w:r>
-    </w:p>
-    <w:p>
-      <w:pPr>
-        <w:spacing w:after="100" w:line="240" w:lineRule="auto"/>
-      </w:pPr>
-      <w:r>
-        <w:rPr>
-          <w:rFonts w:ascii="Times New Roman" w:hAnsi="Times New Roman"/>
-          <w:b w:val="0"/>
-          <w:color w:val="000000"/>
-          <w:sz w:val="24"/>
+        <w:t xml:space="preserve">Obr. </w:t>
+      </w:r>
+      <w:proofErr w:type="gramStart"/>
+      <w:r>
+        <w:rPr>
+          <w:color w:val="000000"/>
+          <w:sz w:val="20"/>
+        </w:rPr>
+        <w:t>1  Zeiss</w:t>
+      </w:r>
+      <w:proofErr w:type="gramEnd"/>
+      <w:r>
+        <w:rPr>
+          <w:color w:val="000000"/>
+          <w:sz w:val="20"/>
+        </w:rPr>
+        <w:t xml:space="preserve"> Theo 020A</w:t>
+      </w:r>
+      <w:r>
+        <w:rPr>
+          <w:color w:val="000000"/>
+          <w:sz w:val="20"/>
+        </w:rPr>
+        <w:t xml:space="preserve"> – bod </w:t>
+      </w:r>
+      <w:r>
+        <w:rPr>
+          <w:color w:val="000000"/>
+          <w:sz w:val="20"/>
+        </w:rPr>
+        <w:t xml:space="preserve">1001 </w:t>
+      </w:r>
+      <w:r>
+        <w:rPr>
+          <w:color w:val="000000"/>
+          <w:sz w:val="20"/>
+        </w:rPr>
+        <w:tab/>
+      </w:r>
+      <w:r>
+        <w:rPr>
+          <w:color w:val="000000"/>
+          <w:sz w:val="20"/>
+        </w:rPr>
+        <w:t xml:space="preserve">           </w:t>
+      </w:r>
+      <w:proofErr w:type="spellStart"/>
+      <w:r>
+        <w:rPr>
+          <w:color w:val="000000"/>
+          <w:sz w:val="20"/>
+        </w:rPr>
+        <w:t>Obr</w:t>
+      </w:r>
+      <w:proofErr w:type="spellEnd"/>
+      <w:r>
+        <w:rPr>
+          <w:color w:val="000000"/>
+          <w:sz w:val="20"/>
+        </w:rPr>
+        <w:t xml:space="preserve">. </w:t>
+      </w:r>
+      <w:proofErr w:type="gramStart"/>
+      <w:r>
+        <w:rPr>
+          <w:color w:val="000000"/>
+          <w:sz w:val="20"/>
+        </w:rPr>
+        <w:t>2  Zeiss</w:t>
+      </w:r>
+      <w:proofErr w:type="gramEnd"/>
+      <w:r>
+        <w:rPr>
+          <w:color w:val="000000"/>
+          <w:sz w:val="20"/>
+        </w:rPr>
+        <w:t xml:space="preserve"> Theo 010A</w:t>
+      </w:r>
+      <w:r>
+        <w:rPr>
+          <w:color w:val="000000"/>
+          <w:sz w:val="20"/>
+        </w:rPr>
+        <w:t xml:space="preserve"> – bod 1003</w:t>
+      </w:r>
+    </w:p>
+    <w:p>
+      <w:pPr>
+        <w:spacing w:after="120"/>
+      </w:pPr>
+      <w:r>
+        <w:rPr>
+          <w:color w:val="000000"/>
+        </w:rPr>
+        <w:t xml:space="preserve">Na ďalšom cvičení sme na Námestí slobody použili Nivel System DT-2 s laserovou olovnicou a Trimble C5 s optickou olovnicou. Statív sme rozložili nad bod, osadili prístroj a posúvaním nôh ho nahrubo zcentrovali. Dĺžkou nôh sme urovnali kruhovú libelu, potom </w:t>
+      </w:r>
+      <w:proofErr w:type="spellStart"/>
+      <w:r>
+        <w:rPr>
+          <w:color w:val="000000"/>
+        </w:rPr>
+        <w:t>dostreďovacími</w:t>
+      </w:r>
+      <w:proofErr w:type="spellEnd"/>
+      <w:r>
+        <w:rPr>
+          <w:color w:val="000000"/>
+        </w:rPr>
+        <w:t xml:space="preserve"> </w:t>
+      </w:r>
+      <w:proofErr w:type="spellStart"/>
+      <w:r>
+        <w:rPr>
+          <w:color w:val="000000"/>
+        </w:rPr>
+        <w:t>skrutkami</w:t>
+      </w:r>
+      <w:proofErr w:type="spellEnd"/>
+      <w:r>
+        <w:rPr>
+          <w:color w:val="000000"/>
+        </w:rPr>
+        <w:t xml:space="preserve"> </w:t>
+      </w:r>
+      <w:proofErr w:type="spellStart"/>
+      <w:r>
+        <w:rPr>
+          <w:color w:val="000000"/>
+        </w:rPr>
+        <w:t>rúrkovú</w:t>
+      </w:r>
+      <w:proofErr w:type="spellEnd"/>
+      <w:r>
+        <w:rPr>
+          <w:color w:val="000000"/>
+        </w:rPr>
+        <w:t xml:space="preserve"> </w:t>
+      </w:r>
+      <w:proofErr w:type="spellStart"/>
+      <w:r>
+        <w:rPr>
+          <w:color w:val="000000"/>
+        </w:rPr>
+        <w:t>libelu</w:t>
+      </w:r>
+      <w:proofErr w:type="spellEnd"/>
+      <w:r>
+        <w:rPr>
+          <w:color w:val="000000"/>
+        </w:rPr>
+        <w:t xml:space="preserve">, </w:t>
+      </w:r>
+      <w:proofErr w:type="spellStart"/>
+      <w:r>
+        <w:rPr>
+          <w:color w:val="000000"/>
+        </w:rPr>
+        <w:t>otocili</w:t>
+      </w:r>
+      <w:proofErr w:type="spellEnd"/>
+      <w:r>
+        <w:rPr>
+          <w:color w:val="000000"/>
+        </w:rPr>
+        <w:t xml:space="preserve"> </w:t>
+      </w:r>
+      <w:proofErr w:type="spellStart"/>
+      <w:r>
+        <w:rPr>
+          <w:color w:val="000000"/>
+        </w:rPr>
+        <w:t>alidadu</w:t>
+      </w:r>
+      <w:proofErr w:type="spellEnd"/>
+      <w:r>
+        <w:rPr>
+          <w:color w:val="000000"/>
+        </w:rPr>
+        <w:t xml:space="preserve"> o 100</w:t>
+      </w:r>
+      <w:r>
+        <w:rPr>
+          <w:color w:val="000000"/>
+          <w:vertAlign w:val="superscript"/>
+        </w:rPr>
+        <w:t xml:space="preserve"> </w:t>
+      </w:r>
+      <w:r>
+        <w:rPr>
+          <w:color w:val="000000"/>
+          <w:vertAlign w:val="superscript"/>
+        </w:rPr>
+        <w:t>g</w:t>
+      </w:r>
+      <w:r>
+        <w:rPr>
+          <w:color w:val="000000"/>
+          <w:vertAlign w:val="superscript"/>
+        </w:rPr>
+        <w:t xml:space="preserve"> </w:t>
+      </w:r>
+      <w:r>
+        <w:rPr>
+          <w:color w:val="000000"/>
+        </w:rPr>
+        <w:t>a</w:t>
+      </w:r>
+      <w:r>
+        <w:rPr>
+          <w:color w:val="000000"/>
+        </w:rPr>
+        <w:t xml:space="preserve"> </w:t>
+      </w:r>
+      <w:proofErr w:type="spellStart"/>
+      <w:r>
+        <w:rPr>
+          <w:color w:val="000000"/>
+        </w:rPr>
+        <w:t>dorovnali</w:t>
+      </w:r>
+      <w:proofErr w:type="spellEnd"/>
+      <w:r>
+        <w:rPr>
+          <w:color w:val="000000"/>
+        </w:rPr>
+        <w:t xml:space="preserve"> </w:t>
+      </w:r>
+      <w:proofErr w:type="spellStart"/>
+      <w:r>
+        <w:rPr>
+          <w:color w:val="000000"/>
+        </w:rPr>
+        <w:t>poslednou</w:t>
+      </w:r>
+      <w:proofErr w:type="spellEnd"/>
+      <w:r>
+        <w:rPr>
+          <w:color w:val="000000"/>
+        </w:rPr>
+        <w:t xml:space="preserve"> </w:t>
+      </w:r>
+      <w:proofErr w:type="spellStart"/>
+      <w:r>
+        <w:rPr>
+          <w:color w:val="000000"/>
+        </w:rPr>
+        <w:t>skrutkou</w:t>
+      </w:r>
+      <w:proofErr w:type="spellEnd"/>
+      <w:r>
+        <w:rPr>
+          <w:color w:val="000000"/>
+        </w:rPr>
+        <w:t xml:space="preserve"> do </w:t>
+      </w:r>
+      <w:proofErr w:type="spellStart"/>
+      <w:r>
+        <w:rPr>
+          <w:color w:val="000000"/>
+        </w:rPr>
+        <w:t>horizontalnej</w:t>
+      </w:r>
+      <w:proofErr w:type="spellEnd"/>
+      <w:r>
+        <w:rPr>
+          <w:color w:val="000000"/>
+        </w:rPr>
+        <w:t xml:space="preserve"> </w:t>
+      </w:r>
+      <w:proofErr w:type="spellStart"/>
+      <w:r>
+        <w:rPr>
+          <w:color w:val="000000"/>
+        </w:rPr>
+        <w:t>roviny</w:t>
+      </w:r>
+      <w:proofErr w:type="spellEnd"/>
+      <w:r>
+        <w:rPr>
+          <w:color w:val="000000"/>
+        </w:rPr>
+        <w:t>.</w:t>
+      </w:r>
+      <w:r>
+        <w:rPr>
+          <w:color w:val="000000"/>
+        </w:rPr>
+        <w:t xml:space="preserve"> </w:t>
+      </w:r>
+      <w:proofErr w:type="spellStart"/>
+      <w:r>
+        <w:rPr>
+          <w:color w:val="000000"/>
+        </w:rPr>
+        <w:t>Jemnú</w:t>
+      </w:r>
+      <w:proofErr w:type="spellEnd"/>
+      <w:r>
+        <w:rPr>
+          <w:color w:val="000000"/>
+        </w:rPr>
+        <w:t xml:space="preserve"> </w:t>
+      </w:r>
+      <w:proofErr w:type="spellStart"/>
+      <w:r>
+        <w:rPr>
+          <w:color w:val="000000"/>
+        </w:rPr>
+        <w:t>centráciu</w:t>
+      </w:r>
+      <w:proofErr w:type="spellEnd"/>
+      <w:r>
+        <w:rPr>
+          <w:color w:val="000000"/>
+        </w:rPr>
+        <w:t xml:space="preserve"> </w:t>
+      </w:r>
+      <w:proofErr w:type="spellStart"/>
+      <w:r>
+        <w:rPr>
+          <w:color w:val="000000"/>
+        </w:rPr>
+        <w:t>sme</w:t>
+      </w:r>
+      <w:proofErr w:type="spellEnd"/>
+      <w:r>
+        <w:rPr>
+          <w:color w:val="000000"/>
+        </w:rPr>
+        <w:t xml:space="preserve"> vykonali posunutím prístroja po hlave statívu. Centráciu a horizontáciu sme kontrolovali a opakovali, kým bol prístroj urovnaný a nad bodom.</w:t>
+      </w:r>
+    </w:p>
+    <w:p>
+      <w:pPr>
+        <w:spacing w:after="120"/>
+      </w:pPr>
+      <w:r>
+        <w:rPr>
+          <w:color w:val="000000"/>
         </w:rPr>
         <w:t>Nivelom sme odčítali 63,6316</w:t>
       </w:r>
       <w:r>
         <w:rPr>
-          <w:rFonts w:ascii="Times New Roman" w:hAnsi="Times New Roman"/>
-          <w:b w:val="0"/>
-          <w:color w:val="000000"/>
-          <w:sz w:val="24"/>
+          <w:color w:val="000000"/>
           <w:vertAlign w:val="superscript"/>
         </w:rPr>
         <w:t>g</w:t>
       </w:r>
       <w:r>
         <w:rPr>
-          <w:rFonts w:ascii="Times New Roman" w:hAnsi="Times New Roman"/>
-          <w:b w:val="0"/>
-          <w:color w:val="000000"/>
-          <w:sz w:val="24"/>
+          <w:color w:val="000000"/>
         </w:rPr>
         <w:t xml:space="preserve"> a 78,1826</w:t>
       </w:r>
       <w:r>
         <w:rPr>
-          <w:rFonts w:ascii="Times New Roman" w:hAnsi="Times New Roman"/>
-          <w:b w:val="0"/>
-          <w:color w:val="000000"/>
-          <w:sz w:val="24"/>
+          <w:color w:val="000000"/>
           <w:vertAlign w:val="superscript"/>
         </w:rPr>
         <w:t>g</w:t>
       </w:r>
       <w:r>
         <w:rPr>
-          <w:rFonts w:ascii="Times New Roman" w:hAnsi="Times New Roman"/>
-          <w:b w:val="0"/>
-          <w:color w:val="000000"/>
-          <w:sz w:val="24"/>
+          <w:color w:val="000000"/>
         </w:rPr>
         <w:t>, Trimblom 250,9716</w:t>
       </w:r>
       <w:r>
         <w:rPr>
-          <w:rFonts w:ascii="Times New Roman" w:hAnsi="Times New Roman"/>
-          <w:b w:val="0"/>
-          <w:color w:val="000000"/>
-          <w:sz w:val="24"/>
+          <w:color w:val="000000"/>
           <w:vertAlign w:val="superscript"/>
         </w:rPr>
         <w:t>g</w:t>
       </w:r>
       <w:r>
         <w:rPr>
-          <w:rFonts w:ascii="Times New Roman" w:hAnsi="Times New Roman"/>
-          <w:b w:val="0"/>
-          <w:color w:val="000000"/>
-          <w:sz w:val="24"/>
+          <w:color w:val="000000"/>
         </w:rPr>
         <w:t xml:space="preserve"> a 262,7426</w:t>
       </w:r>
       <w:r>
         <w:rPr>
-          <w:rFonts w:ascii="Times New Roman" w:hAnsi="Times New Roman"/>
-          <w:b w:val="0"/>
-          <w:color w:val="000000"/>
-          <w:sz w:val="24"/>
+          <w:color w:val="000000"/>
           <w:vertAlign w:val="superscript"/>
         </w:rPr>
         <w:t>g</w:t>
       </w:r>
       <w:r>
         <w:rPr>
-          <w:rFonts w:ascii="Times New Roman" w:hAnsi="Times New Roman"/>
-          <w:b w:val="0"/>
-          <w:color w:val="000000"/>
-          <w:sz w:val="24"/>
+          <w:color w:val="000000"/>
         </w:rPr>
         <w:t>.</w:t>
       </w:r>
     </w:p>
     <w:p>
       <w:pPr>
-        <w:pStyle w:val="Heading1"/>
         <w:keepNext/>
-        <w:spacing w:after="100" w:line="240" w:lineRule="auto" w:before="120"/>
-      </w:pPr>
-      <w:r>
-        <w:rPr>
-          <w:rFonts w:ascii="Times New Roman" w:hAnsi="Times New Roman"/>
+        <w:spacing w:before="240" w:after="120"/>
+      </w:pPr>
+      <w:proofErr w:type="gramStart"/>
+      <w:r>
+        <w:rPr>
           <w:b/>
-          <w:color w:val="000000"/>
-          <w:sz w:val="24"/>
-        </w:rPr>
-        <w:t>3  Postup riešenia úlohy</w:t>
-      </w:r>
-    </w:p>
-    <w:p>
-      <w:pPr>
-        <w:spacing w:after="100" w:line="240" w:lineRule="auto"/>
-      </w:pPr>
-      <w:r>
-        <w:rPr>
-          <w:rFonts w:ascii="Times New Roman" w:hAnsi="Times New Roman"/>
-          <w:b w:val="0"/>
-          <w:color w:val="000000"/>
-          <w:sz w:val="24"/>
-        </w:rPr>
-        <w:t>Vodorovné uhly sme vypočítali ako rozdiel druhého a prvého smeru. Výpočty sú v prílohe A.1.</w:t>
-      </w:r>
-    </w:p>
-    <w:p>
-      <w:pPr>
-        <w:pStyle w:val="Heading1"/>
+          <w:bCs/>
+        </w:rPr>
+        <w:t xml:space="preserve">3  </w:t>
+      </w:r>
+      <w:proofErr w:type="spellStart"/>
+      <w:r>
+        <w:rPr>
+          <w:b/>
+          <w:bCs/>
+        </w:rPr>
+        <w:t>Postup</w:t>
+      </w:r>
+      <w:proofErr w:type="spellEnd"/>
+      <w:proofErr w:type="gramEnd"/>
+      <w:r>
+        <w:rPr>
+          <w:b/>
+          <w:bCs/>
+        </w:rPr>
+        <w:t xml:space="preserve"> </w:t>
+      </w:r>
+      <w:proofErr w:type="spellStart"/>
+      <w:r>
+        <w:rPr>
+          <w:b/>
+          <w:bCs/>
+        </w:rPr>
+        <w:t>riešenia</w:t>
+      </w:r>
+      <w:proofErr w:type="spellEnd"/>
+      <w:r>
+        <w:rPr>
+          <w:b/>
+          <w:bCs/>
+        </w:rPr>
+        <w:t xml:space="preserve"> </w:t>
+      </w:r>
+      <w:proofErr w:type="spellStart"/>
+      <w:r>
+        <w:rPr>
+          <w:b/>
+          <w:bCs/>
+        </w:rPr>
+        <w:t>úlohy</w:t>
+      </w:r>
+      <w:proofErr w:type="spellEnd"/>
+    </w:p>
+    <w:p>
+      <w:pPr>
+        <w:spacing w:after="120"/>
+      </w:pPr>
+      <w:r>
+        <w:rPr>
+          <w:color w:val="000000"/>
+        </w:rPr>
+        <w:t>Vodorovné uhly sme vypočítali ako rozdiel druhého a prvého smeru podľa vzorca (1) v prílohe A.1.</w:t>
+      </w:r>
+    </w:p>
+    <w:p>
+      <w:pPr>
         <w:keepNext/>
-        <w:spacing w:after="100" w:line="240" w:lineRule="auto" w:before="120"/>
-      </w:pPr>
-      <w:r>
-        <w:rPr>
-          <w:rFonts w:ascii="Times New Roman" w:hAnsi="Times New Roman"/>
+        <w:spacing w:before="240" w:after="120"/>
+      </w:pPr>
+      <w:proofErr w:type="gramStart"/>
+      <w:r>
+        <w:rPr>
           <w:b/>
-          <w:color w:val="000000"/>
-          <w:sz w:val="24"/>
-        </w:rPr>
-        <w:t>4  Zhodnotenie výsledkov</w:t>
-      </w:r>
-    </w:p>
-    <w:p>
-      <w:pPr>
-        <w:spacing w:after="100" w:line="240" w:lineRule="auto"/>
-      </w:pPr>
-      <w:r>
-        <w:rPr>
-          <w:rFonts w:ascii="Times New Roman" w:hAnsi="Times New Roman"/>
-          <w:b w:val="0"/>
-          <w:color w:val="000000"/>
-          <w:sz w:val="24"/>
-        </w:rPr>
-        <w:t>Precvičili sme si čítanie smerov na optických prístrojoch a centráciu a horizontáciu elektronických prístrojov v teréne.</w:t>
-      </w:r>
-    </w:p>
-    <w:p>
-      <w:pPr>
-        <w:spacing w:after="100" w:line="240" w:lineRule="auto"/>
-      </w:pPr>
-      <w:r>
-        <w:rPr>
-          <w:rFonts w:ascii="Times New Roman" w:hAnsi="Times New Roman"/>
-          <w:b w:val="0"/>
-          <w:color w:val="000000"/>
-          <w:sz w:val="24"/>
+          <w:bCs/>
+        </w:rPr>
+        <w:t xml:space="preserve">4  </w:t>
+      </w:r>
+      <w:proofErr w:type="spellStart"/>
+      <w:r>
+        <w:rPr>
+          <w:b/>
+          <w:bCs/>
+        </w:rPr>
+        <w:t>Zhodnotenie</w:t>
+      </w:r>
+      <w:proofErr w:type="spellEnd"/>
+      <w:proofErr w:type="gramEnd"/>
+      <w:r>
+        <w:rPr>
+          <w:b/>
+          <w:bCs/>
+        </w:rPr>
+        <w:t xml:space="preserve"> </w:t>
+      </w:r>
+      <w:proofErr w:type="spellStart"/>
+      <w:r>
+        <w:rPr>
+          <w:b/>
+          <w:bCs/>
+        </w:rPr>
+        <w:t>výsledkov</w:t>
+      </w:r>
+      <w:proofErr w:type="spellEnd"/>
+    </w:p>
+    <w:p>
+      <w:pPr>
+        <w:spacing w:after="120"/>
+      </w:pPr>
+      <w:r>
+        <w:rPr>
+          <w:color w:val="000000"/>
+        </w:rPr>
+        <w:t xml:space="preserve">Precvičili sme si </w:t>
+      </w:r>
+      <w:proofErr w:type="spellStart"/>
+      <w:r>
+        <w:rPr>
+          <w:color w:val="000000"/>
+        </w:rPr>
+        <w:t>čítanie</w:t>
+      </w:r>
+      <w:proofErr w:type="spellEnd"/>
+      <w:r>
+        <w:rPr>
+          <w:color w:val="000000"/>
+        </w:rPr>
+        <w:t xml:space="preserve"> </w:t>
+      </w:r>
+      <w:proofErr w:type="spellStart"/>
+      <w:r>
+        <w:rPr>
+          <w:color w:val="000000"/>
+        </w:rPr>
+        <w:t>smerov</w:t>
+      </w:r>
+      <w:proofErr w:type="spellEnd"/>
+      <w:r>
+        <w:rPr>
+          <w:color w:val="000000"/>
+        </w:rPr>
+        <w:t xml:space="preserve"> </w:t>
+      </w:r>
+      <w:proofErr w:type="spellStart"/>
+      <w:r>
+        <w:rPr>
+          <w:color w:val="000000"/>
+        </w:rPr>
+        <w:t>na</w:t>
+      </w:r>
+      <w:proofErr w:type="spellEnd"/>
+      <w:r>
+        <w:rPr>
+          <w:color w:val="000000"/>
+        </w:rPr>
+        <w:t xml:space="preserve"> </w:t>
+      </w:r>
+      <w:proofErr w:type="spellStart"/>
+      <w:r>
+        <w:rPr>
+          <w:color w:val="000000"/>
+        </w:rPr>
+        <w:t>optických</w:t>
+      </w:r>
+      <w:proofErr w:type="spellEnd"/>
+      <w:r>
+        <w:rPr>
+          <w:color w:val="000000"/>
+        </w:rPr>
+        <w:t xml:space="preserve"> </w:t>
+      </w:r>
+      <w:proofErr w:type="spellStart"/>
+      <w:r>
+        <w:rPr>
+          <w:color w:val="000000"/>
+        </w:rPr>
+        <w:t>prístrojoch</w:t>
+      </w:r>
+      <w:proofErr w:type="spellEnd"/>
+      <w:r>
+        <w:rPr>
+          <w:color w:val="000000"/>
+        </w:rPr>
+        <w:t xml:space="preserve"> a </w:t>
+      </w:r>
+      <w:proofErr w:type="spellStart"/>
+      <w:r>
+        <w:rPr>
+          <w:color w:val="000000"/>
+        </w:rPr>
+        <w:t>centráciu</w:t>
+      </w:r>
+      <w:proofErr w:type="spellEnd"/>
+      <w:r>
+        <w:rPr>
+          <w:color w:val="000000"/>
+        </w:rPr>
+        <w:t xml:space="preserve"> a horizontáciu elektronických prístrojov v teréne.</w:t>
+      </w:r>
+    </w:p>
+    <w:p>
+      <w:pPr>
+        <w:spacing w:after="480"/>
+      </w:pPr>
+      <w:r>
+        <w:t xml:space="preserve">V </w:t>
+      </w:r>
+      <w:proofErr w:type="spellStart"/>
+      <w:r>
+        <w:t>Bratislave</w:t>
+      </w:r>
+      <w:proofErr w:type="spellEnd"/>
+      <w:r>
+        <w:t xml:space="preserve">, </w:t>
+      </w:r>
+      <w:proofErr w:type="spellStart"/>
+      <w:r>
+        <w:t>dňa</w:t>
+      </w:r>
+      <w:proofErr w:type="spellEnd"/>
+      <w:r>
+        <w:t xml:space="preserve"> ....................</w:t>
+      </w:r>
+    </w:p>
+    <w:p>
+      <w:pPr>
+        <w:tabs>
+          <w:tab w:val="right" w:pos="9354"/>
+        </w:tabs>
+      </w:pPr>
+      <w:r>
+        <w:rPr>
+          <w:color w:val="000000"/>
         </w:rPr>
         <w:t>Vypracoval: Adam Molnar</w:t>
       </w:r>
+      <w:r>
+        <w:rPr>
+          <w:color w:val="000000"/>
+        </w:rPr>
+        <w:tab/>
+        <w:t>...........................................</w:t>
+      </w:r>
+    </w:p>
+    <w:p>
+      <w:pPr>
+        <w:tabs>
+          <w:tab w:val="right" w:pos="8957"/>
+        </w:tabs>
+      </w:pPr>
+      <w:r>
+        <w:rPr>
+          <w:i/>
+          <w:iCs/>
+          <w:sz w:val="20"/>
+          <w:szCs w:val="20"/>
+        </w:rPr>
+        <w:tab/>
+        <w:t>(</w:t>
+      </w:r>
+      <w:proofErr w:type="spellStart"/>
+      <w:r>
+        <w:rPr>
+          <w:i/>
+          <w:iCs/>
+          <w:sz w:val="20"/>
+          <w:szCs w:val="20"/>
+        </w:rPr>
+        <w:t>vlastnoručný</w:t>
+      </w:r>
+      <w:proofErr w:type="spellEnd"/>
+      <w:r>
+        <w:rPr>
+          <w:i/>
+          <w:iCs/>
+          <w:sz w:val="20"/>
+          <w:szCs w:val="20"/>
+        </w:rPr>
+        <w:t xml:space="preserve"> </w:t>
+      </w:r>
+      <w:proofErr w:type="spellStart"/>
+      <w:r>
+        <w:rPr>
+          <w:i/>
+          <w:iCs/>
+          <w:sz w:val="20"/>
+          <w:szCs w:val="20"/>
+        </w:rPr>
+        <w:t>podpis</w:t>
+      </w:r>
+      <w:proofErr w:type="spellEnd"/>
+      <w:r>
+        <w:rPr>
+          <w:i/>
+          <w:iCs/>
+          <w:sz w:val="20"/>
+          <w:szCs w:val="20"/>
+        </w:rPr>
+        <w:t>)</w:t>
+      </w:r>
     </w:p>
     <w:p>
       <w:pPr>
         <w:sectPr>
-          <w:headerReference w:type="default" r:id="rId9"/>
-          <w:footerReference w:type="default" r:id="rId10"/>
+          <w:headerReference w:type="default" r:id="rId11"/>
+          <w:footerReference w:type="default" r:id="rId12"/>
           <w:pgSz w:w="11906" w:h="16838"/>
           <w:pgMar w:top="1134" w:right="850" w:bottom="1134" w:left="1134" w:header="708" w:footer="708" w:gutter="0"/>
           <w:pgNumType w:start="1"/>
@@ -1523,380 +2164,400 @@
     </w:p>
     <w:p>
       <w:pPr>
-        <w:pStyle w:val="Title"/>
-        <w:spacing w:after="100" w:line="240" w:lineRule="auto"/>
+        <w:spacing w:before="4252"/>
+      </w:pPr>
+    </w:p>
+    <w:p>
+      <w:pPr>
         <w:jc w:val="center"/>
       </w:pPr>
       <w:r>
         <w:rPr>
-          <w:rFonts w:ascii="Times New Roman" w:hAnsi="Times New Roman"/>
           <w:b/>
-          <w:color w:val="000000"/>
+          <w:bCs/>
           <w:sz w:val="28"/>
-        </w:rPr>
-        <w:t>Výpočtový protokol</w:t>
-      </w:r>
-    </w:p>
-    <w:p>
-      <w:pPr>
-        <w:spacing w:after="100" w:line="240" w:lineRule="auto"/>
-      </w:pPr>
-      <w:r>
-        <w:rPr>
-          <w:rFonts w:ascii="Times New Roman" w:hAnsi="Times New Roman"/>
-          <w:b w:val="0"/>
-          <w:color w:val="000000"/>
-          <w:sz w:val="24"/>
+          <w:szCs w:val="28"/>
+        </w:rPr>
+        <w:t>PRÍLOHY</w:t>
+      </w:r>
+    </w:p>
+    <w:p>
+      <w:pPr>
+        <w:spacing w:before="6803"/>
+      </w:pPr>
+    </w:p>
+    <w:p>
+      <w:pPr>
+        <w:spacing w:after="120"/>
+      </w:pPr>
+      <w:proofErr w:type="spellStart"/>
+      <w:r>
+        <w:rPr>
+          <w:b/>
+          <w:bCs/>
+        </w:rPr>
+        <w:t>Zoznam</w:t>
+      </w:r>
+      <w:proofErr w:type="spellEnd"/>
+      <w:r>
+        <w:rPr>
+          <w:b/>
+          <w:bCs/>
+        </w:rPr>
+        <w:t xml:space="preserve"> </w:t>
+      </w:r>
+      <w:proofErr w:type="spellStart"/>
+      <w:r>
+        <w:rPr>
+          <w:b/>
+          <w:bCs/>
+        </w:rPr>
+        <w:t>príloh</w:t>
+      </w:r>
+      <w:proofErr w:type="spellEnd"/>
+      <w:r>
+        <w:rPr>
+          <w:b/>
+          <w:bCs/>
+        </w:rPr>
+        <w:t>:</w:t>
+      </w:r>
+    </w:p>
+    <w:p>
+      <w:pPr>
+        <w:spacing w:after="60"/>
+      </w:pPr>
+      <w:proofErr w:type="spellStart"/>
+      <w:r>
+        <w:t>Príloha</w:t>
+      </w:r>
+      <w:proofErr w:type="spellEnd"/>
+      <w:r>
+        <w:t xml:space="preserve"> A.1   </w:t>
+      </w:r>
+      <w:proofErr w:type="spellStart"/>
+      <w:r>
+        <w:t>Výpočtový</w:t>
+      </w:r>
+      <w:proofErr w:type="spellEnd"/>
+      <w:r>
+        <w:t xml:space="preserve"> </w:t>
+      </w:r>
+      <w:proofErr w:type="spellStart"/>
+      <w:r>
+        <w:t>protokol</w:t>
+      </w:r>
+      <w:proofErr w:type="spellEnd"/>
+    </w:p>
+    <w:p>
+      <w:pPr>
+        <w:sectPr>
+          <w:headerReference w:type="default" r:id="rId13"/>
+          <w:footerReference w:type="default" r:id="rId14"/>
+          <w:pgSz w:w="11906" w:h="16838"/>
+          <w:pgMar w:top="1134" w:right="850" w:bottom="1134" w:left="1134" w:header="708" w:footer="708" w:gutter="0"/>
+          <w:cols w:space="720"/>
+          <w:docGrid w:linePitch="360"/>
+        </w:sectPr>
+      </w:pPr>
+    </w:p>
+    <w:p>
+      <w:pPr>
+        <w:spacing w:after="360"/>
+        <w:jc w:val="center"/>
+      </w:pPr>
+      <w:proofErr w:type="spellStart"/>
+      <w:r>
+        <w:rPr>
+          <w:b/>
+          <w:bCs/>
+          <w:sz w:val="28"/>
+          <w:szCs w:val="28"/>
+        </w:rPr>
+        <w:lastRenderedPageBreak/>
+        <w:t>Výpočtový</w:t>
+      </w:r>
+      <w:proofErr w:type="spellEnd"/>
+      <w:r>
+        <w:rPr>
+          <w:b/>
+          <w:bCs/>
+          <w:sz w:val="28"/>
+          <w:szCs w:val="28"/>
+        </w:rPr>
+        <w:t xml:space="preserve"> </w:t>
+      </w:r>
+      <w:proofErr w:type="spellStart"/>
+      <w:r>
+        <w:rPr>
+          <w:b/>
+          <w:bCs/>
+          <w:sz w:val="28"/>
+          <w:szCs w:val="28"/>
+        </w:rPr>
+        <w:t>protokol</w:t>
+      </w:r>
+      <w:proofErr w:type="spellEnd"/>
+    </w:p>
+    <w:p>
+      <w:pPr>
+        <w:tabs>
+          <w:tab w:val="center" w:pos="4961"/>
+          <w:tab w:val="right" w:pos="9865"/>
+        </w:tabs>
+        <w:spacing w:after="240"/>
+      </w:pPr>
+      <w:r>
+        <w:rPr>
+          <w:color w:val="000000"/>
+        </w:rPr>
+        <w:tab/>
+      </w:r>
+      <w:r>
+        <w:rPr>
+          <w:color w:val="000000"/>
         </w:rPr>
         <w:t>ω = ψB − ψA</w:t>
       </w:r>
-    </w:p>
-    <w:p>
-      <w:pPr>
-        <w:pStyle w:val="Heading1"/>
+      <w:r>
+        <w:rPr>
+          <w:color w:val="000000"/>
+        </w:rPr>
+        <w:tab/>
+        <w:t>(1)</w:t>
+      </w:r>
+    </w:p>
+    <w:p>
+      <w:pPr>
         <w:keepNext/>
-        <w:spacing w:after="100" w:line="240" w:lineRule="auto" w:before="120"/>
-      </w:pPr>
-      <w:r>
-        <w:rPr>
-          <w:rFonts w:ascii="Times New Roman" w:hAnsi="Times New Roman"/>
+        <w:spacing w:before="240" w:after="120"/>
+      </w:pPr>
+      <w:r>
+        <w:rPr>
           <w:b/>
           <w:color w:val="000000"/>
-          <w:sz w:val="24"/>
         </w:rPr>
         <w:t>Zeiss Theo 020A</w:t>
       </w:r>
     </w:p>
     <w:p>
       <w:pPr>
-        <w:spacing w:after="100" w:line="240" w:lineRule="auto"/>
-      </w:pPr>
-      <w:r>
-        <w:rPr>
-          <w:rFonts w:ascii="Times New Roman" w:hAnsi="Times New Roman"/>
-          <w:b w:val="0"/>
-          <w:color w:val="000000"/>
-          <w:sz w:val="24"/>
+        <w:spacing w:after="120"/>
+      </w:pPr>
+      <w:r>
+        <w:rPr>
+          <w:color w:val="000000"/>
         </w:rPr>
         <w:t>ω = 66,6505</w:t>
       </w:r>
       <w:r>
         <w:rPr>
-          <w:rFonts w:ascii="Times New Roman" w:hAnsi="Times New Roman"/>
-          <w:b w:val="0"/>
-          <w:color w:val="000000"/>
-          <w:sz w:val="24"/>
+          <w:color w:val="000000"/>
           <w:vertAlign w:val="superscript"/>
         </w:rPr>
         <w:t>g</w:t>
       </w:r>
       <w:r>
         <w:rPr>
-          <w:rFonts w:ascii="Times New Roman" w:hAnsi="Times New Roman"/>
-          <w:b w:val="0"/>
-          <w:color w:val="000000"/>
-          <w:sz w:val="24"/>
+          <w:color w:val="000000"/>
         </w:rPr>
         <w:t xml:space="preserve"> − 65,3205</w:t>
       </w:r>
       <w:r>
         <w:rPr>
-          <w:rFonts w:ascii="Times New Roman" w:hAnsi="Times New Roman"/>
-          <w:b w:val="0"/>
-          <w:color w:val="000000"/>
-          <w:sz w:val="24"/>
+          <w:color w:val="000000"/>
           <w:vertAlign w:val="superscript"/>
         </w:rPr>
         <w:t>g</w:t>
       </w:r>
       <w:r>
         <w:rPr>
-          <w:rFonts w:ascii="Times New Roman" w:hAnsi="Times New Roman"/>
-          <w:b w:val="0"/>
-          <w:color w:val="000000"/>
-          <w:sz w:val="24"/>
+          <w:color w:val="000000"/>
         </w:rPr>
         <w:t xml:space="preserve"> = 1,3300</w:t>
       </w:r>
       <w:r>
         <w:rPr>
-          <w:rFonts w:ascii="Times New Roman" w:hAnsi="Times New Roman"/>
-          <w:b w:val="0"/>
-          <w:color w:val="000000"/>
-          <w:sz w:val="24"/>
+          <w:color w:val="000000"/>
           <w:vertAlign w:val="superscript"/>
         </w:rPr>
         <w:t>g</w:t>
       </w:r>
-      <w:r>
-        <w:rPr>
-          <w:rFonts w:ascii="Times New Roman" w:hAnsi="Times New Roman"/>
-          <w:b w:val="0"/>
-          <w:color w:val="000000"/>
-          <w:sz w:val="24"/>
-        </w:rPr>
-      </w:r>
-    </w:p>
-    <w:p>
-      <w:pPr>
-        <w:pStyle w:val="Heading1"/>
+    </w:p>
+    <w:p>
+      <w:pPr>
         <w:keepNext/>
-        <w:spacing w:after="100" w:line="240" w:lineRule="auto" w:before="120"/>
-      </w:pPr>
-      <w:r>
-        <w:rPr>
-          <w:rFonts w:ascii="Times New Roman" w:hAnsi="Times New Roman"/>
+        <w:spacing w:before="240" w:after="120"/>
+      </w:pPr>
+      <w:r>
+        <w:rPr>
           <w:b/>
           <w:color w:val="000000"/>
-          <w:sz w:val="24"/>
         </w:rPr>
         <w:t>Zeiss Theo 010A</w:t>
       </w:r>
     </w:p>
     <w:p>
       <w:pPr>
-        <w:spacing w:after="100" w:line="240" w:lineRule="auto"/>
-      </w:pPr>
-      <w:r>
-        <w:rPr>
-          <w:rFonts w:ascii="Times New Roman" w:hAnsi="Times New Roman"/>
-          <w:b w:val="0"/>
-          <w:color w:val="000000"/>
-          <w:sz w:val="24"/>
+        <w:spacing w:after="120"/>
+      </w:pPr>
+      <w:r>
+        <w:rPr>
+          <w:color w:val="000000"/>
         </w:rPr>
         <w:t>ω = 234,4304</w:t>
       </w:r>
       <w:r>
         <w:rPr>
-          <w:rFonts w:ascii="Times New Roman" w:hAnsi="Times New Roman"/>
-          <w:b w:val="0"/>
-          <w:color w:val="000000"/>
-          <w:sz w:val="24"/>
+          <w:color w:val="000000"/>
           <w:vertAlign w:val="superscript"/>
         </w:rPr>
         <w:t>g</w:t>
       </w:r>
       <w:r>
         <w:rPr>
-          <w:rFonts w:ascii="Times New Roman" w:hAnsi="Times New Roman"/>
-          <w:b w:val="0"/>
-          <w:color w:val="000000"/>
-          <w:sz w:val="24"/>
+          <w:color w:val="000000"/>
         </w:rPr>
         <w:t xml:space="preserve"> − 229,5304</w:t>
       </w:r>
       <w:r>
         <w:rPr>
-          <w:rFonts w:ascii="Times New Roman" w:hAnsi="Times New Roman"/>
-          <w:b w:val="0"/>
-          <w:color w:val="000000"/>
-          <w:sz w:val="24"/>
+          <w:color w:val="000000"/>
           <w:vertAlign w:val="superscript"/>
         </w:rPr>
         <w:t>g</w:t>
       </w:r>
       <w:r>
         <w:rPr>
-          <w:rFonts w:ascii="Times New Roman" w:hAnsi="Times New Roman"/>
-          <w:b w:val="0"/>
-          <w:color w:val="000000"/>
-          <w:sz w:val="24"/>
+          <w:color w:val="000000"/>
         </w:rPr>
         <w:t xml:space="preserve"> = 4,9000</w:t>
       </w:r>
       <w:r>
         <w:rPr>
-          <w:rFonts w:ascii="Times New Roman" w:hAnsi="Times New Roman"/>
-          <w:b w:val="0"/>
-          <w:color w:val="000000"/>
-          <w:sz w:val="24"/>
+          <w:color w:val="000000"/>
           <w:vertAlign w:val="superscript"/>
         </w:rPr>
         <w:t>g</w:t>
       </w:r>
-      <w:r>
-        <w:rPr>
-          <w:rFonts w:ascii="Times New Roman" w:hAnsi="Times New Roman"/>
-          <w:b w:val="0"/>
-          <w:color w:val="000000"/>
-          <w:sz w:val="24"/>
-        </w:rPr>
-      </w:r>
-    </w:p>
-    <w:p>
-      <w:pPr>
-        <w:pStyle w:val="Heading1"/>
+    </w:p>
+    <w:p>
+      <w:pPr>
         <w:keepNext/>
-        <w:spacing w:after="100" w:line="240" w:lineRule="auto" w:before="120"/>
-      </w:pPr>
-      <w:r>
-        <w:rPr>
-          <w:rFonts w:ascii="Times New Roman" w:hAnsi="Times New Roman"/>
+        <w:spacing w:before="240" w:after="120"/>
+      </w:pPr>
+      <w:r>
+        <w:rPr>
           <w:b/>
           <w:color w:val="000000"/>
-          <w:sz w:val="24"/>
         </w:rPr>
         <w:t>Nivel System DT-2</w:t>
       </w:r>
     </w:p>
     <w:p>
       <w:pPr>
-        <w:spacing w:after="100" w:line="240" w:lineRule="auto"/>
-      </w:pPr>
-      <w:r>
-        <w:rPr>
-          <w:rFonts w:ascii="Times New Roman" w:hAnsi="Times New Roman"/>
-          <w:b w:val="0"/>
-          <w:color w:val="000000"/>
-          <w:sz w:val="24"/>
+        <w:spacing w:after="120"/>
+      </w:pPr>
+      <w:r>
+        <w:rPr>
+          <w:color w:val="000000"/>
         </w:rPr>
         <w:t>ω = 78,1826</w:t>
       </w:r>
       <w:r>
         <w:rPr>
-          <w:rFonts w:ascii="Times New Roman" w:hAnsi="Times New Roman"/>
-          <w:b w:val="0"/>
-          <w:color w:val="000000"/>
-          <w:sz w:val="24"/>
+          <w:color w:val="000000"/>
           <w:vertAlign w:val="superscript"/>
         </w:rPr>
         <w:t>g</w:t>
       </w:r>
       <w:r>
         <w:rPr>
-          <w:rFonts w:ascii="Times New Roman" w:hAnsi="Times New Roman"/>
-          <w:b w:val="0"/>
-          <w:color w:val="000000"/>
-          <w:sz w:val="24"/>
+          <w:color w:val="000000"/>
         </w:rPr>
         <w:t xml:space="preserve"> − 63,6316</w:t>
       </w:r>
       <w:r>
         <w:rPr>
-          <w:rFonts w:ascii="Times New Roman" w:hAnsi="Times New Roman"/>
-          <w:b w:val="0"/>
-          <w:color w:val="000000"/>
-          <w:sz w:val="24"/>
+          <w:color w:val="000000"/>
           <w:vertAlign w:val="superscript"/>
         </w:rPr>
         <w:t>g</w:t>
       </w:r>
       <w:r>
         <w:rPr>
-          <w:rFonts w:ascii="Times New Roman" w:hAnsi="Times New Roman"/>
-          <w:b w:val="0"/>
-          <w:color w:val="000000"/>
-          <w:sz w:val="24"/>
+          <w:color w:val="000000"/>
         </w:rPr>
         <w:t xml:space="preserve"> = 14,5510</w:t>
       </w:r>
       <w:r>
         <w:rPr>
-          <w:rFonts w:ascii="Times New Roman" w:hAnsi="Times New Roman"/>
-          <w:b w:val="0"/>
-          <w:color w:val="000000"/>
-          <w:sz w:val="24"/>
+          <w:color w:val="000000"/>
           <w:vertAlign w:val="superscript"/>
         </w:rPr>
         <w:t>g</w:t>
       </w:r>
-      <w:r>
-        <w:rPr>
-          <w:rFonts w:ascii="Times New Roman" w:hAnsi="Times New Roman"/>
-          <w:b w:val="0"/>
-          <w:color w:val="000000"/>
-          <w:sz w:val="24"/>
-        </w:rPr>
-      </w:r>
-    </w:p>
-    <w:p>
-      <w:pPr>
-        <w:pStyle w:val="Heading1"/>
+    </w:p>
+    <w:p>
+      <w:pPr>
         <w:keepNext/>
-        <w:spacing w:after="100" w:line="240" w:lineRule="auto" w:before="120"/>
-      </w:pPr>
-      <w:r>
-        <w:rPr>
-          <w:rFonts w:ascii="Times New Roman" w:hAnsi="Times New Roman"/>
+        <w:spacing w:before="240" w:after="120"/>
+      </w:pPr>
+      <w:r>
+        <w:rPr>
           <w:b/>
           <w:color w:val="000000"/>
-          <w:sz w:val="24"/>
         </w:rPr>
         <w:t>Trimble C5</w:t>
       </w:r>
     </w:p>
     <w:p>
       <w:pPr>
-        <w:spacing w:after="100" w:line="240" w:lineRule="auto"/>
-      </w:pPr>
-      <w:r>
-        <w:rPr>
-          <w:rFonts w:ascii="Times New Roman" w:hAnsi="Times New Roman"/>
-          <w:b w:val="0"/>
-          <w:color w:val="000000"/>
-          <w:sz w:val="24"/>
+        <w:spacing w:after="120"/>
+      </w:pPr>
+      <w:r>
+        <w:rPr>
+          <w:color w:val="000000"/>
         </w:rPr>
         <w:t>ω = 262,7426</w:t>
       </w:r>
       <w:r>
         <w:rPr>
-          <w:rFonts w:ascii="Times New Roman" w:hAnsi="Times New Roman"/>
-          <w:b w:val="0"/>
-          <w:color w:val="000000"/>
-          <w:sz w:val="24"/>
+          <w:color w:val="000000"/>
           <w:vertAlign w:val="superscript"/>
         </w:rPr>
         <w:t>g</w:t>
       </w:r>
       <w:r>
         <w:rPr>
-          <w:rFonts w:ascii="Times New Roman" w:hAnsi="Times New Roman"/>
-          <w:b w:val="0"/>
-          <w:color w:val="000000"/>
-          <w:sz w:val="24"/>
+          <w:color w:val="000000"/>
         </w:rPr>
         <w:t xml:space="preserve"> − 250,9716</w:t>
       </w:r>
       <w:r>
         <w:rPr>
-          <w:rFonts w:ascii="Times New Roman" w:hAnsi="Times New Roman"/>
-          <w:b w:val="0"/>
-          <w:color w:val="000000"/>
-          <w:sz w:val="24"/>
+          <w:color w:val="000000"/>
           <w:vertAlign w:val="superscript"/>
         </w:rPr>
         <w:t>g</w:t>
       </w:r>
       <w:r>
         <w:rPr>
-          <w:rFonts w:ascii="Times New Roman" w:hAnsi="Times New Roman"/>
-          <w:b w:val="0"/>
-          <w:color w:val="000000"/>
-          <w:sz w:val="24"/>
+          <w:color w:val="000000"/>
         </w:rPr>
         <w:t xml:space="preserve"> = 11,7710</w:t>
       </w:r>
       <w:r>
         <w:rPr>
-          <w:rFonts w:ascii="Times New Roman" w:hAnsi="Times New Roman"/>
-          <w:b w:val="0"/>
-          <w:color w:val="000000"/>
-          <w:sz w:val="24"/>
+          <w:color w:val="000000"/>
           <w:vertAlign w:val="superscript"/>
         </w:rPr>
         <w:t>g</w:t>
       </w:r>
-      <w:r>
-        <w:rPr>
-          <w:rFonts w:ascii="Times New Roman" w:hAnsi="Times New Roman"/>
-          <w:b w:val="0"/>
-          <w:color w:val="000000"/>
-          <w:sz w:val="24"/>
-        </w:rPr>
-      </w:r>
     </w:p>
     <w:sectPr>
-      <w:headerReference w:type="default" r:id="rId25"/>
+      <w:headerReference w:type="default" r:id="rId15"/>
+      <w:footerReference w:type="default" r:id="rId16"/>
       <w:pgSz w:w="11906" w:h="16838"/>
       <w:pgMar w:top="1134" w:right="850" w:bottom="1134" w:left="1134" w:header="708" w:footer="708" w:gutter="0"/>
       <w:cols w:space="720"/>
@@ -1927,11 +2588,7 @@
 
 <file path=word/footer1.xml><?xml version="1.0" encoding="utf-8"?>
 <w:ftr xmlns:wpc="http://schemas.microsoft.com/office/word/2010/wordprocessingCanvas" xmlns:cx="http://schemas.microsoft.com/office/drawing/2014/chartex" xmlns:cx1="http://schemas.microsoft.com/office/drawing/2015/9/8/chartex" xmlns:cx2="http://schemas.microsoft.com/office/drawing/2015/10/21/chartex" xmlns:cx3="http://schemas.microsoft.com/office/drawing/2016/5/9/chartex" xmlns:cx4="http://schemas.microsoft.com/office/drawing/2016/5/10/chartex" xmlns:cx5="http://schemas.microsoft.com/office/drawing/2016/5/11/chartex" xmlns:cx6="http://schemas.microsoft.com/office/drawing/2016/5/12/chartex" xmlns:cx7="http://schemas.microsoft.com/office/drawing/2016/5/13/chartex" xmlns:cx8="http://schemas.microsoft.com/office/drawing/2016/5/14/chartex" xmlns:mc="http://schemas.openxmlformats.org/markup-compatibility/2006" xmlns:aink="http://schemas.microsoft.com/office/drawing/2016/ink" xmlns:am3d="http://schemas.microsoft.com/office/drawing/2017/model3d" xmlns:o="urn:schemas-microsoft-com:office:office" xmlns:oel="http://schemas.microsoft.com/office/2019/extlst" xmlns:r="http://schemas.openxmlformats.org/officeDocument/2006/relationships" xmlns:m="http://schemas.openxmlformats.org/officeDocument/2006/math" xmlns:v="urn:schemas-microsoft-com:vml" xmlns:wp14="http://schemas.microsoft.com/office/word/2010/wordprocessingDrawing" xmlns:wp="http://schemas.openxmlformats.org/drawingml/2006/wordprocessingDrawing" xmlns:w10="urn:schemas-microsoft-com:office:word" xmlns:w="http://schemas.openxmlformats.org/wordprocessingml/2006/main" xmlns:w14="http://schemas.microsoft.com/office/word/2010/wordml" xmlns:w15="http://schemas.microsoft.com/office/word/2012/wordml" xmlns:w16cex="http://schemas.microsoft.com/office/word/2018/wordml/cex" xmlns:w16cid="http://schemas.microsoft.com/office/word/2016/wordml/cid" xmlns:w16="http://schemas.microsoft.com/office/word/2018/wordml" xmlns:w16du="http://schemas.microsoft.com/office/word/2023/wordml/word16du" xmlns:w16sdtdh="http://schemas.microsoft.com/office/word/2020/wordml/sdtdatahash" xmlns:w16sdtfl="http://schemas.microsoft.com/office/word/2024/wordml/sdtformatlock" xmlns:w16se="http://schemas.microsoft.com/office/word/2015/wordml/symex" xmlns:wpg="http://schemas.microsoft.com/office/word/2010/wordprocessingGroup" xmlns:wpi="http://schemas.microsoft.com/office/word/2010/wordprocessingInk" xmlns:wne="http://schemas.microsoft.com/office/word/2006/wordml" xmlns:wps="http://schemas.microsoft.com/office/word/2010/wordprocessingShape" mc:Ignorable="w14 w15 w16se w16cid w16 w16cex w16sdtdh w16sdtfl w16du wp14">
-  <w:p>
-    <w:pPr>
-      <w:widowControl/>
-    </w:pPr>
-  </w:p>
+  <w:p/>
 </w:ftr>
 </file>
 
@@ -1940,50 +2597,39 @@
   <w:p>
     <w:pPr>
       <w:jc w:val="right"/>
-      <w:widowControl/>
     </w:pPr>
     <w:r>
       <w:rPr>
-        <w:rFonts w:ascii="Times New Roman" w:hAnsi="Times New Roman"/>
-        <w:color w:val="000000"/>
-        <w:sz w:val="20"/>
+        <w:sz w:val="22"/>
         <w:szCs w:val="22"/>
       </w:rPr>
       <w:fldChar w:fldCharType="begin"/>
     </w:r>
     <w:r>
       <w:rPr>
-        <w:rFonts w:ascii="Times New Roman" w:hAnsi="Times New Roman"/>
-        <w:color w:val="000000"/>
-        <w:sz w:val="20"/>
+        <w:sz w:val="22"/>
         <w:szCs w:val="22"/>
       </w:rPr>
       <w:instrText>PAGE</w:instrText>
     </w:r>
     <w:r>
       <w:rPr>
-        <w:rFonts w:ascii="Times New Roman" w:hAnsi="Times New Roman"/>
-        <w:color w:val="000000"/>
-        <w:sz w:val="20"/>
+        <w:sz w:val="22"/>
         <w:szCs w:val="22"/>
       </w:rPr>
       <w:fldChar w:fldCharType="separate"/>
     </w:r>
     <w:r>
       <w:rPr>
-        <w:rFonts w:ascii="Times New Roman" w:hAnsi="Times New Roman"/>
         <w:noProof/>
-        <w:color w:val="000000"/>
-        <w:sz w:val="20"/>
+        <w:sz w:val="22"/>
         <w:szCs w:val="22"/>
       </w:rPr>
       <w:t>1</w:t>
     </w:r>
     <w:r>
       <w:rPr>
-        <w:rFonts w:ascii="Times New Roman" w:hAnsi="Times New Roman"/>
-        <w:color w:val="000000"/>
-        <w:sz w:val="20"/>
+        <w:sz w:val="22"/>
         <w:szCs w:val="22"/>
       </w:rPr>
       <w:fldChar w:fldCharType="end"/>
@@ -1997,12 +2643,9 @@
   <w:p>
     <w:pPr>
       <w:jc w:val="right"/>
-      <w:widowControl/>
     </w:pPr>
     <w:r>
       <w:rPr>
-        <w:rFonts w:ascii="Times New Roman" w:hAnsi="Times New Roman"/>
-        <w:color w:val="000000"/>
         <w:sz w:val="22"/>
         <w:szCs w:val="22"/>
       </w:rPr>
@@ -2010,8 +2653,6 @@
     </w:r>
     <w:r>
       <w:rPr>
-        <w:rFonts w:ascii="Times New Roman" w:hAnsi="Times New Roman"/>
-        <w:color w:val="000000"/>
         <w:sz w:val="22"/>
         <w:szCs w:val="22"/>
       </w:rPr>
@@ -2019,8 +2660,6 @@
     </w:r>
     <w:r>
       <w:rPr>
-        <w:rFonts w:ascii="Times New Roman" w:hAnsi="Times New Roman"/>
-        <w:color w:val="000000"/>
         <w:sz w:val="22"/>
         <w:szCs w:val="22"/>
       </w:rPr>
@@ -2028,9 +2667,7 @@
     </w:r>
     <w:r>
       <w:rPr>
-        <w:rFonts w:ascii="Times New Roman" w:hAnsi="Times New Roman"/>
         <w:noProof/>
-        <w:color w:val="000000"/>
         <w:sz w:val="22"/>
         <w:szCs w:val="22"/>
       </w:rPr>
@@ -2038,8 +2675,6 @@
     </w:r>
     <w:r>
       <w:rPr>
-        <w:rFonts w:ascii="Times New Roman" w:hAnsi="Times New Roman"/>
-        <w:color w:val="000000"/>
         <w:sz w:val="22"/>
         <w:szCs w:val="22"/>
       </w:rPr>
@@ -2054,12 +2689,9 @@
   <w:p>
     <w:pPr>
       <w:jc w:val="right"/>
-      <w:widowControl/>
     </w:pPr>
     <w:r>
       <w:rPr>
-        <w:rFonts w:ascii="Times New Roman" w:hAnsi="Times New Roman"/>
-        <w:color w:val="000000"/>
         <w:sz w:val="22"/>
         <w:szCs w:val="22"/>
       </w:rPr>
@@ -2067,8 +2699,6 @@
     </w:r>
     <w:r>
       <w:rPr>
-        <w:rFonts w:ascii="Times New Roman" w:hAnsi="Times New Roman"/>
-        <w:color w:val="000000"/>
         <w:sz w:val="22"/>
         <w:szCs w:val="22"/>
       </w:rPr>
@@ -2076,8 +2706,6 @@
     </w:r>
     <w:r>
       <w:rPr>
-        <w:rFonts w:ascii="Times New Roman" w:hAnsi="Times New Roman"/>
-        <w:color w:val="000000"/>
         <w:sz w:val="22"/>
         <w:szCs w:val="22"/>
       </w:rPr>
@@ -2085,9 +2713,7 @@
     </w:r>
     <w:r>
       <w:rPr>
-        <w:rFonts w:ascii="Times New Roman" w:hAnsi="Times New Roman"/>
         <w:noProof/>
-        <w:color w:val="000000"/>
         <w:sz w:val="22"/>
         <w:szCs w:val="22"/>
       </w:rPr>
@@ -2095,179 +2721,6 @@
     </w:r>
     <w:r>
       <w:rPr>
-        <w:rFonts w:ascii="Times New Roman" w:hAnsi="Times New Roman"/>
-        <w:color w:val="000000"/>
-        <w:sz w:val="22"/>
-        <w:szCs w:val="22"/>
-      </w:rPr>
-      <w:fldChar w:fldCharType="end"/>
-    </w:r>
-  </w:p>
-</w:ftr>
-</file>
-
-<file path=word/footer5.xml><?xml version="1.0" encoding="utf-8"?>
-<w:ftr xmlns:wpc="http://schemas.microsoft.com/office/word/2010/wordprocessingCanvas" xmlns:cx="http://schemas.microsoft.com/office/drawing/2014/chartex" xmlns:cx1="http://schemas.microsoft.com/office/drawing/2015/9/8/chartex" xmlns:cx2="http://schemas.microsoft.com/office/drawing/2015/10/21/chartex" xmlns:cx3="http://schemas.microsoft.com/office/drawing/2016/5/9/chartex" xmlns:cx4="http://schemas.microsoft.com/office/drawing/2016/5/10/chartex" xmlns:cx5="http://schemas.microsoft.com/office/drawing/2016/5/11/chartex" xmlns:cx6="http://schemas.microsoft.com/office/drawing/2016/5/12/chartex" xmlns:cx7="http://schemas.microsoft.com/office/drawing/2016/5/13/chartex" xmlns:cx8="http://schemas.microsoft.com/office/drawing/2016/5/14/chartex" xmlns:mc="http://schemas.openxmlformats.org/markup-compatibility/2006" xmlns:aink="http://schemas.microsoft.com/office/drawing/2016/ink" xmlns:am3d="http://schemas.microsoft.com/office/drawing/2017/model3d" xmlns:o="urn:schemas-microsoft-com:office:office" xmlns:oel="http://schemas.microsoft.com/office/2019/extlst" xmlns:r="http://schemas.openxmlformats.org/officeDocument/2006/relationships" xmlns:m="http://schemas.openxmlformats.org/officeDocument/2006/math" xmlns:v="urn:schemas-microsoft-com:vml" xmlns:wp14="http://schemas.microsoft.com/office/word/2010/wordprocessingDrawing" xmlns:wp="http://schemas.openxmlformats.org/drawingml/2006/wordprocessingDrawing" xmlns:w10="urn:schemas-microsoft-com:office:word" xmlns:w="http://schemas.openxmlformats.org/wordprocessingml/2006/main" xmlns:w14="http://schemas.microsoft.com/office/word/2010/wordml" xmlns:w15="http://schemas.microsoft.com/office/word/2012/wordml" xmlns:w16cex="http://schemas.microsoft.com/office/word/2018/wordml/cex" xmlns:w16cid="http://schemas.microsoft.com/office/word/2016/wordml/cid" xmlns:w16="http://schemas.microsoft.com/office/word/2018/wordml" xmlns:w16du="http://schemas.microsoft.com/office/word/2023/wordml/word16du" xmlns:w16sdtdh="http://schemas.microsoft.com/office/word/2020/wordml/sdtdatahash" xmlns:w16sdtfl="http://schemas.microsoft.com/office/word/2024/wordml/sdtformatlock" xmlns:w16se="http://schemas.microsoft.com/office/word/2015/wordml/symex" xmlns:wpg="http://schemas.microsoft.com/office/word/2010/wordprocessingGroup" xmlns:wpi="http://schemas.microsoft.com/office/word/2010/wordprocessingInk" xmlns:wne="http://schemas.microsoft.com/office/word/2006/wordml" xmlns:wps="http://schemas.microsoft.com/office/word/2010/wordprocessingShape" mc:Ignorable="w14 w15 w16se w16cid w16 w16cex w16sdtdh w16sdtfl w16du wp14">
-  <w:p>
-    <w:pPr>
-      <w:jc w:val="right"/>
-      <w:widowControl/>
-    </w:pPr>
-    <w:r>
-      <w:rPr>
-        <w:rFonts w:ascii="Times New Roman" w:hAnsi="Times New Roman"/>
-        <w:color w:val="000000"/>
-        <w:sz w:val="22"/>
-        <w:szCs w:val="22"/>
-      </w:rPr>
-      <w:fldChar w:fldCharType="begin"/>
-    </w:r>
-    <w:r>
-      <w:rPr>
-        <w:rFonts w:ascii="Times New Roman" w:hAnsi="Times New Roman"/>
-        <w:color w:val="000000"/>
-        <w:sz w:val="22"/>
-        <w:szCs w:val="22"/>
-      </w:rPr>
-      <w:instrText>PAGE</w:instrText>
-    </w:r>
-    <w:r>
-      <w:rPr>
-        <w:rFonts w:ascii="Times New Roman" w:hAnsi="Times New Roman"/>
-        <w:color w:val="000000"/>
-        <w:sz w:val="22"/>
-        <w:szCs w:val="22"/>
-      </w:rPr>
-      <w:fldChar w:fldCharType="separate"/>
-    </w:r>
-    <w:r>
-      <w:rPr>
-        <w:rFonts w:ascii="Times New Roman" w:hAnsi="Times New Roman"/>
-        <w:noProof/>
-        <w:color w:val="000000"/>
-        <w:sz w:val="22"/>
-        <w:szCs w:val="22"/>
-      </w:rPr>
-      <w:t>4</w:t>
-    </w:r>
-    <w:r>
-      <w:rPr>
-        <w:rFonts w:ascii="Times New Roman" w:hAnsi="Times New Roman"/>
-        <w:color w:val="000000"/>
-        <w:sz w:val="22"/>
-        <w:szCs w:val="22"/>
-      </w:rPr>
-      <w:fldChar w:fldCharType="end"/>
-    </w:r>
-  </w:p>
-</w:ftr>
-</file>
-
-<file path=word/footer6.xml><?xml version="1.0" encoding="utf-8"?>
-<w:ftr xmlns:wpc="http://schemas.microsoft.com/office/word/2010/wordprocessingCanvas" xmlns:cx="http://schemas.microsoft.com/office/drawing/2014/chartex" xmlns:cx1="http://schemas.microsoft.com/office/drawing/2015/9/8/chartex" xmlns:cx2="http://schemas.microsoft.com/office/drawing/2015/10/21/chartex" xmlns:cx3="http://schemas.microsoft.com/office/drawing/2016/5/9/chartex" xmlns:cx4="http://schemas.microsoft.com/office/drawing/2016/5/10/chartex" xmlns:cx5="http://schemas.microsoft.com/office/drawing/2016/5/11/chartex" xmlns:cx6="http://schemas.microsoft.com/office/drawing/2016/5/12/chartex" xmlns:cx7="http://schemas.microsoft.com/office/drawing/2016/5/13/chartex" xmlns:cx8="http://schemas.microsoft.com/office/drawing/2016/5/14/chartex" xmlns:mc="http://schemas.openxmlformats.org/markup-compatibility/2006" xmlns:aink="http://schemas.microsoft.com/office/drawing/2016/ink" xmlns:am3d="http://schemas.microsoft.com/office/drawing/2017/model3d" xmlns:o="urn:schemas-microsoft-com:office:office" xmlns:oel="http://schemas.microsoft.com/office/2019/extlst" xmlns:r="http://schemas.openxmlformats.org/officeDocument/2006/relationships" xmlns:m="http://schemas.openxmlformats.org/officeDocument/2006/math" xmlns:v="urn:schemas-microsoft-com:vml" xmlns:wp14="http://schemas.microsoft.com/office/word/2010/wordprocessingDrawing" xmlns:wp="http://schemas.openxmlformats.org/drawingml/2006/wordprocessingDrawing" xmlns:w10="urn:schemas-microsoft-com:office:word" xmlns:w="http://schemas.openxmlformats.org/wordprocessingml/2006/main" xmlns:w14="http://schemas.microsoft.com/office/word/2010/wordml" xmlns:w15="http://schemas.microsoft.com/office/word/2012/wordml" xmlns:w16cex="http://schemas.microsoft.com/office/word/2018/wordml/cex" xmlns:w16cid="http://schemas.microsoft.com/office/word/2016/wordml/cid" xmlns:w16="http://schemas.microsoft.com/office/word/2018/wordml" xmlns:w16du="http://schemas.microsoft.com/office/word/2023/wordml/word16du" xmlns:w16sdtdh="http://schemas.microsoft.com/office/word/2020/wordml/sdtdatahash" xmlns:w16sdtfl="http://schemas.microsoft.com/office/word/2024/wordml/sdtformatlock" xmlns:w16se="http://schemas.microsoft.com/office/word/2015/wordml/symex" xmlns:wpg="http://schemas.microsoft.com/office/word/2010/wordprocessingGroup" xmlns:wpi="http://schemas.microsoft.com/office/word/2010/wordprocessingInk" xmlns:wne="http://schemas.microsoft.com/office/word/2006/wordml" xmlns:wps="http://schemas.microsoft.com/office/word/2010/wordprocessingShape" mc:Ignorable="w14 w15 w16se w16cid w16 w16cex w16sdtdh w16sdtfl w16du wp14">
-  <w:p>
-    <w:pPr>
-      <w:jc w:val="right"/>
-      <w:widowControl/>
-    </w:pPr>
-    <w:r>
-      <w:rPr>
-        <w:rFonts w:ascii="Times New Roman" w:hAnsi="Times New Roman"/>
-        <w:color w:val="000000"/>
-        <w:sz w:val="22"/>
-        <w:szCs w:val="22"/>
-      </w:rPr>
-      <w:fldChar w:fldCharType="begin"/>
-    </w:r>
-    <w:r>
-      <w:rPr>
-        <w:rFonts w:ascii="Times New Roman" w:hAnsi="Times New Roman"/>
-        <w:color w:val="000000"/>
-        <w:sz w:val="22"/>
-        <w:szCs w:val="22"/>
-      </w:rPr>
-      <w:instrText>PAGE</w:instrText>
-    </w:r>
-    <w:r>
-      <w:rPr>
-        <w:rFonts w:ascii="Times New Roman" w:hAnsi="Times New Roman"/>
-        <w:color w:val="000000"/>
-        <w:sz w:val="22"/>
-        <w:szCs w:val="22"/>
-      </w:rPr>
-      <w:fldChar w:fldCharType="separate"/>
-    </w:r>
-    <w:r>
-      <w:rPr>
-        <w:rFonts w:ascii="Times New Roman" w:hAnsi="Times New Roman"/>
-        <w:noProof/>
-        <w:color w:val="000000"/>
-        <w:sz w:val="22"/>
-        <w:szCs w:val="22"/>
-      </w:rPr>
-      <w:t>5</w:t>
-    </w:r>
-    <w:r>
-      <w:rPr>
-        <w:rFonts w:ascii="Times New Roman" w:hAnsi="Times New Roman"/>
-        <w:color w:val="000000"/>
-        <w:sz w:val="22"/>
-        <w:szCs w:val="22"/>
-      </w:rPr>
-      <w:fldChar w:fldCharType="end"/>
-    </w:r>
-  </w:p>
-</w:ftr>
-</file>
-
-<file path=word/footer7.xml><?xml version="1.0" encoding="utf-8"?>
-<w:ftr xmlns:wpc="http://schemas.microsoft.com/office/word/2010/wordprocessingCanvas" xmlns:cx="http://schemas.microsoft.com/office/drawing/2014/chartex" xmlns:cx1="http://schemas.microsoft.com/office/drawing/2015/9/8/chartex" xmlns:cx2="http://schemas.microsoft.com/office/drawing/2015/10/21/chartex" xmlns:cx3="http://schemas.microsoft.com/office/drawing/2016/5/9/chartex" xmlns:cx4="http://schemas.microsoft.com/office/drawing/2016/5/10/chartex" xmlns:cx5="http://schemas.microsoft.com/office/drawing/2016/5/11/chartex" xmlns:cx6="http://schemas.microsoft.com/office/drawing/2016/5/12/chartex" xmlns:cx7="http://schemas.microsoft.com/office/drawing/2016/5/13/chartex" xmlns:cx8="http://schemas.microsoft.com/office/drawing/2016/5/14/chartex" xmlns:mc="http://schemas.openxmlformats.org/markup-compatibility/2006" xmlns:aink="http://schemas.microsoft.com/office/drawing/2016/ink" xmlns:am3d="http://schemas.microsoft.com/office/drawing/2017/model3d" xmlns:o="urn:schemas-microsoft-com:office:office" xmlns:oel="http://schemas.microsoft.com/office/2019/extlst" xmlns:r="http://schemas.openxmlformats.org/officeDocument/2006/relationships" xmlns:m="http://schemas.openxmlformats.org/officeDocument/2006/math" xmlns:v="urn:schemas-microsoft-com:vml" xmlns:wp14="http://schemas.microsoft.com/office/word/2010/wordprocessingDrawing" xmlns:wp="http://schemas.openxmlformats.org/drawingml/2006/wordprocessingDrawing" xmlns:w10="urn:schemas-microsoft-com:office:word" xmlns:w="http://schemas.openxmlformats.org/wordprocessingml/2006/main" xmlns:w14="http://schemas.microsoft.com/office/word/2010/wordml" xmlns:w15="http://schemas.microsoft.com/office/word/2012/wordml" xmlns:w16cex="http://schemas.microsoft.com/office/word/2018/wordml/cex" xmlns:w16cid="http://schemas.microsoft.com/office/word/2016/wordml/cid" xmlns:w16="http://schemas.microsoft.com/office/word/2018/wordml" xmlns:w16du="http://schemas.microsoft.com/office/word/2023/wordml/word16du" xmlns:w16sdtdh="http://schemas.microsoft.com/office/word/2020/wordml/sdtdatahash" xmlns:w16sdtfl="http://schemas.microsoft.com/office/word/2024/wordml/sdtformatlock" xmlns:w16se="http://schemas.microsoft.com/office/word/2015/wordml/symex" xmlns:wpg="http://schemas.microsoft.com/office/word/2010/wordprocessingGroup" xmlns:wpi="http://schemas.microsoft.com/office/word/2010/wordprocessingInk" xmlns:wne="http://schemas.microsoft.com/office/word/2006/wordml" xmlns:wps="http://schemas.microsoft.com/office/word/2010/wordprocessingShape" mc:Ignorable="w14 w15 w16se w16cid w16 w16cex w16sdtdh w16sdtfl w16du wp14">
-  <w:p>
-    <w:pPr>
-      <w:jc w:val="right"/>
-      <w:widowControl/>
-    </w:pPr>
-    <w:r>
-      <w:rPr>
-        <w:rFonts w:ascii="Times New Roman" w:hAnsi="Times New Roman"/>
-        <w:color w:val="000000"/>
-        <w:sz w:val="22"/>
-        <w:szCs w:val="22"/>
-      </w:rPr>
-      <w:fldChar w:fldCharType="begin"/>
-    </w:r>
-    <w:r>
-      <w:rPr>
-        <w:rFonts w:ascii="Times New Roman" w:hAnsi="Times New Roman"/>
-        <w:color w:val="000000"/>
-        <w:sz w:val="22"/>
-        <w:szCs w:val="22"/>
-      </w:rPr>
-      <w:instrText>PAGE</w:instrText>
-    </w:r>
-    <w:r>
-      <w:rPr>
-        <w:rFonts w:ascii="Times New Roman" w:hAnsi="Times New Roman"/>
-        <w:color w:val="000000"/>
-        <w:sz w:val="22"/>
-        <w:szCs w:val="22"/>
-      </w:rPr>
-      <w:fldChar w:fldCharType="separate"/>
-    </w:r>
-    <w:r>
-      <w:rPr>
-        <w:rFonts w:ascii="Times New Roman" w:hAnsi="Times New Roman"/>
-        <w:noProof/>
-        <w:color w:val="000000"/>
-        <w:sz w:val="22"/>
-        <w:szCs w:val="22"/>
-      </w:rPr>
-      <w:t>6</w:t>
-    </w:r>
-    <w:r>
-      <w:rPr>
-        <w:rFonts w:ascii="Times New Roman" w:hAnsi="Times New Roman"/>
-        <w:color w:val="000000"/>
         <w:sz w:val="22"/>
         <w:szCs w:val="22"/>
       </w:rPr>
@@ -2298,31 +2751,19 @@
 
 <file path=word/header1.xml><?xml version="1.0" encoding="utf-8"?>
 <w:hdr xmlns:wpc="http://schemas.microsoft.com/office/word/2010/wordprocessingCanvas" xmlns:cx="http://schemas.microsoft.com/office/drawing/2014/chartex" xmlns:cx1="http://schemas.microsoft.com/office/drawing/2015/9/8/chartex" xmlns:cx2="http://schemas.microsoft.com/office/drawing/2015/10/21/chartex" xmlns:cx3="http://schemas.microsoft.com/office/drawing/2016/5/9/chartex" xmlns:cx4="http://schemas.microsoft.com/office/drawing/2016/5/10/chartex" xmlns:cx5="http://schemas.microsoft.com/office/drawing/2016/5/11/chartex" xmlns:cx6="http://schemas.microsoft.com/office/drawing/2016/5/12/chartex" xmlns:cx7="http://schemas.microsoft.com/office/drawing/2016/5/13/chartex" xmlns:cx8="http://schemas.microsoft.com/office/drawing/2016/5/14/chartex" xmlns:mc="http://schemas.openxmlformats.org/markup-compatibility/2006" xmlns:aink="http://schemas.microsoft.com/office/drawing/2016/ink" xmlns:am3d="http://schemas.microsoft.com/office/drawing/2017/model3d" xmlns:o="urn:schemas-microsoft-com:office:office" xmlns:oel="http://schemas.microsoft.com/office/2019/extlst" xmlns:r="http://schemas.openxmlformats.org/officeDocument/2006/relationships" xmlns:m="http://schemas.openxmlformats.org/officeDocument/2006/math" xmlns:v="urn:schemas-microsoft-com:vml" xmlns:wp14="http://schemas.microsoft.com/office/word/2010/wordprocessingDrawing" xmlns:wp="http://schemas.openxmlformats.org/drawingml/2006/wordprocessingDrawing" xmlns:w10="urn:schemas-microsoft-com:office:word" xmlns:w="http://schemas.openxmlformats.org/wordprocessingml/2006/main" xmlns:w14="http://schemas.microsoft.com/office/word/2010/wordml" xmlns:w15="http://schemas.microsoft.com/office/word/2012/wordml" xmlns:w16cex="http://schemas.microsoft.com/office/word/2018/wordml/cex" xmlns:w16cid="http://schemas.microsoft.com/office/word/2016/wordml/cid" xmlns:w16="http://schemas.microsoft.com/office/word/2018/wordml" xmlns:w16du="http://schemas.microsoft.com/office/word/2023/wordml/word16du" xmlns:w16sdtdh="http://schemas.microsoft.com/office/word/2020/wordml/sdtdatahash" xmlns:w16sdtfl="http://schemas.microsoft.com/office/word/2024/wordml/sdtformatlock" xmlns:w16se="http://schemas.microsoft.com/office/word/2015/wordml/symex" xmlns:wpg="http://schemas.microsoft.com/office/word/2010/wordprocessingGroup" xmlns:wpi="http://schemas.microsoft.com/office/word/2010/wordprocessingInk" xmlns:wne="http://schemas.microsoft.com/office/word/2006/wordml" xmlns:wps="http://schemas.microsoft.com/office/word/2010/wordprocessingShape" mc:Ignorable="w14 w15 w16se w16cid w16 w16cex w16sdtdh w16sdtfl w16du wp14">
-  <w:p>
-    <w:pPr>
-      <w:widowControl/>
-    </w:pPr>
-  </w:p>
+  <w:p/>
 </w:hdr>
 </file>
 
 <file path=word/header2.xml><?xml version="1.0" encoding="utf-8"?>
 <w:hdr xmlns:wpc="http://schemas.microsoft.com/office/word/2010/wordprocessingCanvas" xmlns:cx="http://schemas.microsoft.com/office/drawing/2014/chartex" xmlns:cx1="http://schemas.microsoft.com/office/drawing/2015/9/8/chartex" xmlns:cx2="http://schemas.microsoft.com/office/drawing/2015/10/21/chartex" xmlns:cx3="http://schemas.microsoft.com/office/drawing/2016/5/9/chartex" xmlns:cx4="http://schemas.microsoft.com/office/drawing/2016/5/10/chartex" xmlns:cx5="http://schemas.microsoft.com/office/drawing/2016/5/11/chartex" xmlns:cx6="http://schemas.microsoft.com/office/drawing/2016/5/12/chartex" xmlns:cx7="http://schemas.microsoft.com/office/drawing/2016/5/13/chartex" xmlns:cx8="http://schemas.microsoft.com/office/drawing/2016/5/14/chartex" xmlns:mc="http://schemas.openxmlformats.org/markup-compatibility/2006" xmlns:aink="http://schemas.microsoft.com/office/drawing/2016/ink" xmlns:am3d="http://schemas.microsoft.com/office/drawing/2017/model3d" xmlns:o="urn:schemas-microsoft-com:office:office" xmlns:oel="http://schemas.microsoft.com/office/2019/extlst" xmlns:r="http://schemas.openxmlformats.org/officeDocument/2006/relationships" xmlns:m="http://schemas.openxmlformats.org/officeDocument/2006/math" xmlns:v="urn:schemas-microsoft-com:vml" xmlns:wp14="http://schemas.microsoft.com/office/word/2010/wordprocessingDrawing" xmlns:wp="http://schemas.openxmlformats.org/drawingml/2006/wordprocessingDrawing" xmlns:w10="urn:schemas-microsoft-com:office:word" xmlns:w="http://schemas.openxmlformats.org/wordprocessingml/2006/main" xmlns:w14="http://schemas.microsoft.com/office/word/2010/wordml" xmlns:w15="http://schemas.microsoft.com/office/word/2012/wordml" xmlns:w16cex="http://schemas.microsoft.com/office/word/2018/wordml/cex" xmlns:w16cid="http://schemas.microsoft.com/office/word/2016/wordml/cid" xmlns:w16="http://schemas.microsoft.com/office/word/2018/wordml" xmlns:w16du="http://schemas.microsoft.com/office/word/2023/wordml/word16du" xmlns:w16sdtdh="http://schemas.microsoft.com/office/word/2020/wordml/sdtdatahash" xmlns:w16sdtfl="http://schemas.microsoft.com/office/word/2024/wordml/sdtformatlock" xmlns:w16se="http://schemas.microsoft.com/office/word/2015/wordml/symex" xmlns:wpg="http://schemas.microsoft.com/office/word/2010/wordprocessingGroup" xmlns:wpi="http://schemas.microsoft.com/office/word/2010/wordprocessingInk" xmlns:wne="http://schemas.microsoft.com/office/word/2006/wordml" xmlns:wps="http://schemas.microsoft.com/office/word/2010/wordprocessingShape" mc:Ignorable="w14 w15 w16se w16cid w16 w16cex w16sdtdh w16sdtfl w16du wp14">
-  <w:p>
-    <w:pPr>
-      <w:widowControl/>
-    </w:pPr>
-  </w:p>
+  <w:p/>
 </w:hdr>
 </file>
 
 <file path=word/header3.xml><?xml version="1.0" encoding="utf-8"?>
 <w:hdr xmlns:wpc="http://schemas.microsoft.com/office/word/2010/wordprocessingCanvas" xmlns:cx="http://schemas.microsoft.com/office/drawing/2014/chartex" xmlns:cx1="http://schemas.microsoft.com/office/drawing/2015/9/8/chartex" xmlns:cx2="http://schemas.microsoft.com/office/drawing/2015/10/21/chartex" xmlns:cx3="http://schemas.microsoft.com/office/drawing/2016/5/9/chartex" xmlns:cx4="http://schemas.microsoft.com/office/drawing/2016/5/10/chartex" xmlns:cx5="http://schemas.microsoft.com/office/drawing/2016/5/11/chartex" xmlns:cx6="http://schemas.microsoft.com/office/drawing/2016/5/12/chartex" xmlns:cx7="http://schemas.microsoft.com/office/drawing/2016/5/13/chartex" xmlns:cx8="http://schemas.microsoft.com/office/drawing/2016/5/14/chartex" xmlns:mc="http://schemas.openxmlformats.org/markup-compatibility/2006" xmlns:aink="http://schemas.microsoft.com/office/drawing/2016/ink" xmlns:am3d="http://schemas.microsoft.com/office/drawing/2017/model3d" xmlns:o="urn:schemas-microsoft-com:office:office" xmlns:oel="http://schemas.microsoft.com/office/2019/extlst" xmlns:r="http://schemas.openxmlformats.org/officeDocument/2006/relationships" xmlns:m="http://schemas.openxmlformats.org/officeDocument/2006/math" xmlns:v="urn:schemas-microsoft-com:vml" xmlns:wp14="http://schemas.microsoft.com/office/word/2010/wordprocessingDrawing" xmlns:wp="http://schemas.openxmlformats.org/drawingml/2006/wordprocessingDrawing" xmlns:w10="urn:schemas-microsoft-com:office:word" xmlns:w="http://schemas.openxmlformats.org/wordprocessingml/2006/main" xmlns:w14="http://schemas.microsoft.com/office/word/2010/wordml" xmlns:w15="http://schemas.microsoft.com/office/word/2012/wordml" xmlns:w16cex="http://schemas.microsoft.com/office/word/2018/wordml/cex" xmlns:w16cid="http://schemas.microsoft.com/office/word/2016/wordml/cid" xmlns:w16="http://schemas.microsoft.com/office/word/2018/wordml" xmlns:w16du="http://schemas.microsoft.com/office/word/2023/wordml/word16du" xmlns:w16sdtdh="http://schemas.microsoft.com/office/word/2020/wordml/sdtdatahash" xmlns:w16sdtfl="http://schemas.microsoft.com/office/word/2024/wordml/sdtformatlock" xmlns:w16se="http://schemas.microsoft.com/office/word/2015/wordml/symex" xmlns:wpg="http://schemas.microsoft.com/office/word/2010/wordprocessingGroup" xmlns:wpi="http://schemas.microsoft.com/office/word/2010/wordprocessingInk" xmlns:wne="http://schemas.microsoft.com/office/word/2006/wordml" xmlns:wps="http://schemas.microsoft.com/office/word/2010/wordprocessingShape" mc:Ignorable="w14 w15 w16se w16cid w16 w16cex w16sdtdh w16sdtfl w16du wp14">
-  <w:p>
-    <w:pPr>
-      <w:widowControl/>
-    </w:pPr>
-  </w:p>
+  <w:p/>
 </w:hdr>
 </file>
 
@@ -2330,128 +2771,15 @@
 <w:hdr xmlns:wpc="http://schemas.microsoft.com/office/word/2010/wordprocessingCanvas" xmlns:cx="http://schemas.microsoft.com/office/drawing/2014/chartex" xmlns:cx1="http://schemas.microsoft.com/office/drawing/2015/9/8/chartex" xmlns:cx2="http://schemas.microsoft.com/office/drawing/2015/10/21/chartex" xmlns:cx3="http://schemas.microsoft.com/office/drawing/2016/5/9/chartex" xmlns:cx4="http://schemas.microsoft.com/office/drawing/2016/5/10/chartex" xmlns:cx5="http://schemas.microsoft.com/office/drawing/2016/5/11/chartex" xmlns:cx6="http://schemas.microsoft.com/office/drawing/2016/5/12/chartex" xmlns:cx7="http://schemas.microsoft.com/office/drawing/2016/5/13/chartex" xmlns:cx8="http://schemas.microsoft.com/office/drawing/2016/5/14/chartex" xmlns:mc="http://schemas.openxmlformats.org/markup-compatibility/2006" xmlns:aink="http://schemas.microsoft.com/office/drawing/2016/ink" xmlns:am3d="http://schemas.microsoft.com/office/drawing/2017/model3d" xmlns:o="urn:schemas-microsoft-com:office:office" xmlns:oel="http://schemas.microsoft.com/office/2019/extlst" xmlns:r="http://schemas.openxmlformats.org/officeDocument/2006/relationships" xmlns:m="http://schemas.openxmlformats.org/officeDocument/2006/math" xmlns:v="urn:schemas-microsoft-com:vml" xmlns:wp14="http://schemas.microsoft.com/office/word/2010/wordprocessingDrawing" xmlns:wp="http://schemas.openxmlformats.org/drawingml/2006/wordprocessingDrawing" xmlns:w10="urn:schemas-microsoft-com:office:word" xmlns:w="http://schemas.openxmlformats.org/wordprocessingml/2006/main" xmlns:w14="http://schemas.microsoft.com/office/word/2010/wordml" xmlns:w15="http://schemas.microsoft.com/office/word/2012/wordml" xmlns:w16cex="http://schemas.microsoft.com/office/word/2018/wordml/cex" xmlns:w16cid="http://schemas.microsoft.com/office/word/2016/wordml/cid" xmlns:w16="http://schemas.microsoft.com/office/word/2018/wordml" xmlns:w16du="http://schemas.microsoft.com/office/word/2023/wordml/word16du" xmlns:w16sdtdh="http://schemas.microsoft.com/office/word/2020/wordml/sdtdatahash" xmlns:w16sdtfl="http://schemas.microsoft.com/office/word/2024/wordml/sdtformatlock" xmlns:w16se="http://schemas.microsoft.com/office/word/2015/wordml/symex" xmlns:wpg="http://schemas.microsoft.com/office/word/2010/wordprocessingGroup" xmlns:wpi="http://schemas.microsoft.com/office/word/2010/wordprocessingInk" xmlns:wne="http://schemas.microsoft.com/office/word/2006/wordml" xmlns:wps="http://schemas.microsoft.com/office/word/2010/wordprocessingShape" mc:Ignorable="w14 w15 w16se w16cid w16 w16cex w16sdtdh w16sdtfl w16du wp14">
   <w:p>
     <w:pPr>
-      <w:spacing w:after="120" w:line="259" w:lineRule="auto"/>
       <w:jc w:val="right"/>
-      <w:widowControl/>
-    </w:pPr>
-    <w:r>
-      <w:rPr>
-        <w:b w:val="0"/>
-        <w:sz w:val="20"/>
-      </w:rPr>
-      <w:t>Príloha A.1</w:t>
-    </w:r>
-  </w:p>
-</w:hdr>
-</file>
-
-<file path=word/header5.xml><?xml version="1.0" encoding="utf-8"?>
-<w:hdr xmlns:wpc="http://schemas.microsoft.com/office/word/2010/wordprocessingCanvas" xmlns:cx="http://schemas.microsoft.com/office/drawing/2014/chartex" xmlns:cx1="http://schemas.microsoft.com/office/drawing/2015/9/8/chartex" xmlns:cx2="http://schemas.microsoft.com/office/drawing/2015/10/21/chartex" xmlns:cx3="http://schemas.microsoft.com/office/drawing/2016/5/9/chartex" xmlns:cx4="http://schemas.microsoft.com/office/drawing/2016/5/10/chartex" xmlns:cx5="http://schemas.microsoft.com/office/drawing/2016/5/11/chartex" xmlns:cx6="http://schemas.microsoft.com/office/drawing/2016/5/12/chartex" xmlns:cx7="http://schemas.microsoft.com/office/drawing/2016/5/13/chartex" xmlns:cx8="http://schemas.microsoft.com/office/drawing/2016/5/14/chartex" xmlns:mc="http://schemas.openxmlformats.org/markup-compatibility/2006" xmlns:aink="http://schemas.microsoft.com/office/drawing/2016/ink" xmlns:am3d="http://schemas.microsoft.com/office/drawing/2017/model3d" xmlns:o="urn:schemas-microsoft-com:office:office" xmlns:oel="http://schemas.microsoft.com/office/2019/extlst" xmlns:r="http://schemas.openxmlformats.org/officeDocument/2006/relationships" xmlns:m="http://schemas.openxmlformats.org/officeDocument/2006/math" xmlns:v="urn:schemas-microsoft-com:vml" xmlns:wp14="http://schemas.microsoft.com/office/word/2010/wordprocessingDrawing" xmlns:wp="http://schemas.openxmlformats.org/drawingml/2006/wordprocessingDrawing" xmlns:w10="urn:schemas-microsoft-com:office:word" xmlns:w="http://schemas.openxmlformats.org/wordprocessingml/2006/main" xmlns:w14="http://schemas.microsoft.com/office/word/2010/wordml" xmlns:w15="http://schemas.microsoft.com/office/word/2012/wordml" xmlns:w16cex="http://schemas.microsoft.com/office/word/2018/wordml/cex" xmlns:w16cid="http://schemas.microsoft.com/office/word/2016/wordml/cid" xmlns:w16="http://schemas.microsoft.com/office/word/2018/wordml" xmlns:w16du="http://schemas.microsoft.com/office/word/2023/wordml/word16du" xmlns:w16sdtdh="http://schemas.microsoft.com/office/word/2020/wordml/sdtdatahash" xmlns:w16sdtfl="http://schemas.microsoft.com/office/word/2024/wordml/sdtformatlock" xmlns:w16se="http://schemas.microsoft.com/office/word/2015/wordml/symex" xmlns:wpg="http://schemas.microsoft.com/office/word/2010/wordprocessingGroup" xmlns:wpi="http://schemas.microsoft.com/office/word/2010/wordprocessingInk" xmlns:wne="http://schemas.microsoft.com/office/word/2006/wordml" xmlns:wps="http://schemas.microsoft.com/office/word/2010/wordprocessingShape" mc:Ignorable="w14 w15 w16se w16cid w16 w16cex w16sdtdh w16sdtfl w16du wp14">
-  <w:p>
-    <w:pPr>
-      <w:jc w:val="right"/>
-      <w:widowControl/>
     </w:pPr>
     <w:proofErr w:type="spellStart"/>
     <w:r>
-      <w:rPr>
-        <w:rFonts w:ascii="Times New Roman" w:hAnsi="Times New Roman"/>
-        <w:color w:val="000000"/>
-        <w:sz w:val="22"/>
-        <w:szCs w:val="22"/>
-      </w:rPr>
       <w:t>Príloha</w:t>
     </w:r>
     <w:proofErr w:type="spellEnd"/>
     <w:r>
-      <w:rPr>
-        <w:rFonts w:ascii="Times New Roman" w:hAnsi="Times New Roman"/>
-        <w:color w:val="000000"/>
-        <w:sz w:val="22"/>
-        <w:szCs w:val="22"/>
-      </w:rPr>
-      <w:t xml:space="preserve"> A.2</w:t>
-    </w:r>
-  </w:p>
-</w:hdr>
-</file>
-
-<file path=word/header6.xml><?xml version="1.0" encoding="utf-8"?>
-<w:hdr xmlns:wpc="http://schemas.microsoft.com/office/word/2010/wordprocessingCanvas" xmlns:cx="http://schemas.microsoft.com/office/drawing/2014/chartex" xmlns:cx1="http://schemas.microsoft.com/office/drawing/2015/9/8/chartex" xmlns:cx2="http://schemas.microsoft.com/office/drawing/2015/10/21/chartex" xmlns:cx3="http://schemas.microsoft.com/office/drawing/2016/5/9/chartex" xmlns:cx4="http://schemas.microsoft.com/office/drawing/2016/5/10/chartex" xmlns:cx5="http://schemas.microsoft.com/office/drawing/2016/5/11/chartex" xmlns:cx6="http://schemas.microsoft.com/office/drawing/2016/5/12/chartex" xmlns:cx7="http://schemas.microsoft.com/office/drawing/2016/5/13/chartex" xmlns:cx8="http://schemas.microsoft.com/office/drawing/2016/5/14/chartex" xmlns:mc="http://schemas.openxmlformats.org/markup-compatibility/2006" xmlns:aink="http://schemas.microsoft.com/office/drawing/2016/ink" xmlns:am3d="http://schemas.microsoft.com/office/drawing/2017/model3d" xmlns:o="urn:schemas-microsoft-com:office:office" xmlns:oel="http://schemas.microsoft.com/office/2019/extlst" xmlns:r="http://schemas.openxmlformats.org/officeDocument/2006/relationships" xmlns:m="http://schemas.openxmlformats.org/officeDocument/2006/math" xmlns:v="urn:schemas-microsoft-com:vml" xmlns:wp14="http://schemas.microsoft.com/office/word/2010/wordprocessingDrawing" xmlns:wp="http://schemas.openxmlformats.org/drawingml/2006/wordprocessingDrawing" xmlns:w10="urn:schemas-microsoft-com:office:word" xmlns:w="http://schemas.openxmlformats.org/wordprocessingml/2006/main" xmlns:w14="http://schemas.microsoft.com/office/word/2010/wordml" xmlns:w15="http://schemas.microsoft.com/office/word/2012/wordml" xmlns:w16cex="http://schemas.microsoft.com/office/word/2018/wordml/cex" xmlns:w16cid="http://schemas.microsoft.com/office/word/2016/wordml/cid" xmlns:w16="http://schemas.microsoft.com/office/word/2018/wordml" xmlns:w16du="http://schemas.microsoft.com/office/word/2023/wordml/word16du" xmlns:w16sdtdh="http://schemas.microsoft.com/office/word/2020/wordml/sdtdatahash" xmlns:w16sdtfl="http://schemas.microsoft.com/office/word/2024/wordml/sdtformatlock" xmlns:w16se="http://schemas.microsoft.com/office/word/2015/wordml/symex" xmlns:wpg="http://schemas.microsoft.com/office/word/2010/wordprocessingGroup" xmlns:wpi="http://schemas.microsoft.com/office/word/2010/wordprocessingInk" xmlns:wne="http://schemas.microsoft.com/office/word/2006/wordml" xmlns:wps="http://schemas.microsoft.com/office/word/2010/wordprocessingShape" mc:Ignorable="w14 w15 w16se w16cid w16 w16cex w16sdtdh w16sdtfl w16du wp14">
-  <w:p>
-    <w:pPr>
-      <w:jc w:val="right"/>
-      <w:widowControl/>
-    </w:pPr>
-    <w:proofErr w:type="spellStart"/>
-    <w:r>
-      <w:rPr>
-        <w:rFonts w:ascii="Times New Roman" w:hAnsi="Times New Roman"/>
-        <w:color w:val="000000"/>
-        <w:sz w:val="22"/>
-        <w:szCs w:val="22"/>
-      </w:rPr>
-      <w:t>Príloha</w:t>
-    </w:r>
-    <w:proofErr w:type="spellEnd"/>
-    <w:r>
-      <w:rPr>
-        <w:rFonts w:ascii="Times New Roman" w:hAnsi="Times New Roman"/>
-        <w:color w:val="000000"/>
-        <w:sz w:val="22"/>
-        <w:szCs w:val="22"/>
-      </w:rPr>
-      <w:t xml:space="preserve"> A.3</w:t>
-    </w:r>
-  </w:p>
-</w:hdr>
-</file>
-
-<file path=word/header7.xml><?xml version="1.0" encoding="utf-8"?>
-<w:hdr xmlns:wpc="http://schemas.microsoft.com/office/word/2010/wordprocessingCanvas" xmlns:cx="http://schemas.microsoft.com/office/drawing/2014/chartex" xmlns:cx1="http://schemas.microsoft.com/office/drawing/2015/9/8/chartex" xmlns:cx2="http://schemas.microsoft.com/office/drawing/2015/10/21/chartex" xmlns:cx3="http://schemas.microsoft.com/office/drawing/2016/5/9/chartex" xmlns:cx4="http://schemas.microsoft.com/office/drawing/2016/5/10/chartex" xmlns:cx5="http://schemas.microsoft.com/office/drawing/2016/5/11/chartex" xmlns:cx6="http://schemas.microsoft.com/office/drawing/2016/5/12/chartex" xmlns:cx7="http://schemas.microsoft.com/office/drawing/2016/5/13/chartex" xmlns:cx8="http://schemas.microsoft.com/office/drawing/2016/5/14/chartex" xmlns:mc="http://schemas.openxmlformats.org/markup-compatibility/2006" xmlns:aink="http://schemas.microsoft.com/office/drawing/2016/ink" xmlns:am3d="http://schemas.microsoft.com/office/drawing/2017/model3d" xmlns:o="urn:schemas-microsoft-com:office:office" xmlns:oel="http://schemas.microsoft.com/office/2019/extlst" xmlns:r="http://schemas.openxmlformats.org/officeDocument/2006/relationships" xmlns:m="http://schemas.openxmlformats.org/officeDocument/2006/math" xmlns:v="urn:schemas-microsoft-com:vml" xmlns:wp14="http://schemas.microsoft.com/office/word/2010/wordprocessingDrawing" xmlns:wp="http://schemas.openxmlformats.org/drawingml/2006/wordprocessingDrawing" xmlns:w10="urn:schemas-microsoft-com:office:word" xmlns:w="http://schemas.openxmlformats.org/wordprocessingml/2006/main" xmlns:w14="http://schemas.microsoft.com/office/word/2010/wordml" xmlns:w15="http://schemas.microsoft.com/office/word/2012/wordml" xmlns:w16cex="http://schemas.microsoft.com/office/word/2018/wordml/cex" xmlns:w16cid="http://schemas.microsoft.com/office/word/2016/wordml/cid" xmlns:w16="http://schemas.microsoft.com/office/word/2018/wordml" xmlns:w16du="http://schemas.microsoft.com/office/word/2023/wordml/word16du" xmlns:w16sdtdh="http://schemas.microsoft.com/office/word/2020/wordml/sdtdatahash" xmlns:w16sdtfl="http://schemas.microsoft.com/office/word/2024/wordml/sdtformatlock" xmlns:w16se="http://schemas.microsoft.com/office/word/2015/wordml/symex" xmlns:wpg="http://schemas.microsoft.com/office/word/2010/wordprocessingGroup" xmlns:wpi="http://schemas.microsoft.com/office/word/2010/wordprocessingInk" xmlns:wne="http://schemas.microsoft.com/office/word/2006/wordml" xmlns:wps="http://schemas.microsoft.com/office/word/2010/wordprocessingShape" mc:Ignorable="w14 w15 w16se w16cid w16 w16cex w16sdtdh w16sdtfl w16du wp14">
-  <w:p>
-    <w:pPr>
-      <w:jc w:val="right"/>
-      <w:widowControl/>
-    </w:pPr>
-    <w:proofErr w:type="spellStart"/>
-    <w:r>
-      <w:rPr>
-        <w:rFonts w:ascii="Times New Roman" w:hAnsi="Times New Roman"/>
-        <w:color w:val="000000"/>
-        <w:sz w:val="22"/>
-        <w:szCs w:val="22"/>
-      </w:rPr>
-      <w:t>Príloha</w:t>
-    </w:r>
-    <w:proofErr w:type="spellEnd"/>
-    <w:r>
-      <w:rPr>
-        <w:rFonts w:ascii="Times New Roman" w:hAnsi="Times New Roman"/>
-        <w:color w:val="000000"/>
-        <w:sz w:val="22"/>
-        <w:szCs w:val="22"/>
-      </w:rPr>
-      <w:t xml:space="preserve"> B.1</w:t>
-    </w:r>
-  </w:p>
-</w:hdr>
-</file>
-
-<file path=word/header8.xml><?xml version="1.0" encoding="utf-8"?>
-<w:hdr xmlns:m="http://schemas.openxmlformats.org/officeDocument/2006/math" xmlns:mc="http://schemas.openxmlformats.org/markup-compatibility/2006" xmlns:mo="http://schemas.microsoft.com/office/mac/office/2008/main" xmlns:mv="urn:schemas-microsoft-com:mac:vml" xmlns:o="urn:schemas-microsoft-com:office:office" xmlns:r="http://schemas.openxmlformats.org/officeDocument/2006/relationships" xmlns:v="urn:schemas-microsoft-com:vml" xmlns:w10="urn:schemas-microsoft-com:office:word" xmlns:w14="http://schemas.microsoft.com/office/word/2010/wordml" xmlns:w="http://schemas.openxmlformats.org/wordprocessingml/2006/main" xmlns:wne="http://schemas.microsoft.com/office/word/2006/wordml" xmlns:wp14="http://schemas.microsoft.com/office/word/2010/wordprocessingDrawing" xmlns:wp="http://schemas.openxmlformats.org/drawingml/2006/wordprocessingDrawing" xmlns:wpc="http://schemas.microsoft.com/office/word/2010/wordprocessingCanvas" xmlns:wpg="http://schemas.microsoft.com/office/word/2010/wordprocessingGroup" xmlns:wpi="http://schemas.microsoft.com/office/word/2010/wordprocessingInk" xmlns:wps="http://schemas.microsoft.com/office/word/2010/wordprocessingShape" mc:Ignorable="w14 wp14">
-  <w:p>
-    <w:pPr>
-      <w:pStyle w:val="Header"/>
-      <w:jc w:val="right"/>
-    </w:pPr>
-    <w:r>
-      <w:rPr>
-        <w:rFonts w:ascii="Times New Roman" w:hAnsi="Times New Roman"/>
-        <w:color w:val="000000"/>
-        <w:sz w:val="20"/>
-      </w:rPr>
-      <w:t>Príloha A.1</w:t>
+      <w:t xml:space="preserve"> A.1</w:t>
     </w:r>
   </w:p>
 </w:hdr>
@@ -2948,11 +3276,6 @@
   <w:style w:type="paragraph" w:default="1" w:styleId="Normal">
     <w:name w:val="Normal"/>
     <w:qFormat/>
-    <w:rPr>
-      <w:rFonts w:ascii="Times New Roman" w:hAnsi="Times New Roman"/>
-      <w:color w:val="000000"/>
-      <w:sz w:val="24"/>
-    </w:rPr>
   </w:style>
   <w:style w:type="paragraph" w:styleId="Heading1">
     <w:name w:val="heading 1"/>
@@ -2962,8 +3285,7 @@
       <w:outlineLvl w:val="0"/>
     </w:pPr>
     <w:rPr>
-      <w:rFonts w:ascii="Times New Roman" w:hAnsi="Times New Roman"/>
-      <w:color w:val="000000"/>
+      <w:color w:val="2E74B5"/>
       <w:sz w:val="32"/>
       <w:szCs w:val="32"/>
     </w:rPr>
@@ -2978,8 +3300,7 @@
       <w:outlineLvl w:val="1"/>
     </w:pPr>
     <w:rPr>
-      <w:rFonts w:ascii="Times New Roman" w:hAnsi="Times New Roman"/>
-      <w:color w:val="000000"/>
+      <w:color w:val="2E74B5"/>
       <w:sz w:val="26"/>
       <w:szCs w:val="26"/>
     </w:rPr>
@@ -3070,8 +3391,6 @@
     <w:uiPriority w:val="10"/>
     <w:qFormat/>
     <w:rPr>
-      <w:rFonts w:ascii="Times New Roman" w:hAnsi="Times New Roman"/>
-      <w:color w:val="000000"/>
       <w:sz w:val="56"/>
       <w:szCs w:val="56"/>
     </w:rPr>

</xml_diff>